<commit_message>
Cierre de las actividades 1 y 2: video de 60 s, portadas con docente y bitácora actualizada
- docs/actividad-01/Video_Actividad01_60s.mp4: video de la aplicación (registro con foto, filtros, validación y 33/33 pruebas)
- Informes APA 7: carrera y docente completados; renglones para los 5 integrantes
- Bitácora de IA: integrantes, docente y entrada del cierre
- .gitignore: archivos de espacio de trabajo de VS Code

Co-Authored-By: Claude Opus 5.5 <noreply@anthropic.com>
</commit_message>
<xml_diff>
--- a/docs/actividad-01/Informe_Actividad01_APA.docx
+++ b/docs/actividad-01/Informe_Actividad01_APA.docx
@@ -174,7 +174,7 @@
         <w:rPr>
           <w:highlight w:val="yellow"/>
         </w:rPr>
-        <w:t>Nombre del integrante 2</w:t>
+        <w:t>Nombre completo (GitHub: RonSalvet)</w:t>
       </w:r>
     </w:p>
     <w:p>
@@ -191,7 +191,41 @@
         <w:rPr>
           <w:highlight w:val="yellow"/>
         </w:rPr>
-        <w:t>Nombre del integrante 3</w:t>
+        <w:t>Nombre completo (GitHub: tolavi)</w:t>
+      </w:r>
+    </w:p>
+    <w:p>
+      <w:pPr>
+        <w:keepNext/>
+        <w:spacing w:line="360" w:lineRule="auto"/>
+        <w:ind w:firstLine="0"/>
+        <w:jc w:val="center"/>
+      </w:pPr>
+      <w:r>
+        <w:t xml:space="preserve">4. </w:t>
+      </w:r>
+      <w:r>
+        <w:rPr>
+          <w:highlight w:val="yellow"/>
+        </w:rPr>
+        <w:t>Nombre completo (GitHub: JUANJOVICO2021)</w:t>
+      </w:r>
+    </w:p>
+    <w:p>
+      <w:pPr>
+        <w:keepNext/>
+        <w:spacing w:line="360" w:lineRule="auto"/>
+        <w:ind w:firstLine="0"/>
+        <w:jc w:val="center"/>
+      </w:pPr>
+      <w:r>
+        <w:t xml:space="preserve">5. </w:t>
+      </w:r>
+      <w:r>
+        <w:rPr>
+          <w:highlight w:val="yellow"/>
+        </w:rPr>
+        <w:t>Nombre completo (GitHub: leinn04)</w:t>
       </w:r>
     </w:p>
     <w:p>
@@ -202,13 +236,7 @@
         <w:jc w:val="center"/>
       </w:pPr>
       <w:r>
-        <w:t xml:space="preserve">Carrera: </w:t>
-      </w:r>
-      <w:r>
-        <w:rPr>
-          <w:highlight w:val="yellow"/>
-        </w:rPr>
-        <w:t>Ingeniería de Sistemas</w:t>
+        <w:t>Carrera: Ingeniería de Sistemas</w:t>
       </w:r>
     </w:p>
     <w:p>
@@ -230,13 +258,7 @@
         <w:jc w:val="center"/>
       </w:pPr>
       <w:r>
-        <w:t xml:space="preserve">Docente: </w:t>
-      </w:r>
-      <w:r>
-        <w:rPr>
-          <w:highlight w:val="yellow"/>
-        </w:rPr>
-        <w:t>Nombre del docente</w:t>
+        <w:t>Docente: M.Sc. Ing. Jimmy Nataniel Requena Llorentty</w:t>
       </w:r>
     </w:p>
     <w:p>
@@ -300,7 +322,7 @@
       <w:r>
         <w:fldChar w:fldCharType="separate"/>
       </w:r>
-      <w:hyperlink w:anchor="_Toc242742097" w:history="1">
+      <w:hyperlink w:anchor="_Toc242826179" w:history="1">
         <w:r>
           <w:rPr>
             <w:rStyle w:val="Hyperlink"/>
@@ -327,7 +349,7 @@
             <w:noProof/>
             <w:webHidden/>
           </w:rPr>
-          <w:instrText xml:space="preserve"> PAGEREF _Toc242742097 \h </w:instrText>
+          <w:instrText xml:space="preserve"> PAGEREF _Toc242826179 \h </w:instrText>
         </w:r>
         <w:r>
           <w:rPr>
@@ -374,7 +396,7 @@
           <w14:ligatures w14:val="standardContextual"/>
         </w:rPr>
       </w:pPr>
-      <w:hyperlink w:anchor="_Toc242742098" w:history="1">
+      <w:hyperlink w:anchor="_Toc242826180" w:history="1">
         <w:r>
           <w:rPr>
             <w:rStyle w:val="Hyperlink"/>
@@ -401,7 +423,7 @@
             <w:noProof/>
             <w:webHidden/>
           </w:rPr>
-          <w:instrText xml:space="preserve"> PAGEREF _Toc242742098 \h </w:instrText>
+          <w:instrText xml:space="preserve"> PAGEREF _Toc242826180 \h </w:instrText>
         </w:r>
         <w:r>
           <w:rPr>
@@ -448,7 +470,7 @@
           <w14:ligatures w14:val="standardContextual"/>
         </w:rPr>
       </w:pPr>
-      <w:hyperlink w:anchor="_Toc242742099" w:history="1">
+      <w:hyperlink w:anchor="_Toc242826181" w:history="1">
         <w:r>
           <w:rPr>
             <w:rStyle w:val="Hyperlink"/>
@@ -475,7 +497,7 @@
             <w:noProof/>
             <w:webHidden/>
           </w:rPr>
-          <w:instrText xml:space="preserve"> PAGEREF _Toc242742099 \h </w:instrText>
+          <w:instrText xml:space="preserve"> PAGEREF _Toc242826181 \h </w:instrText>
         </w:r>
         <w:r>
           <w:rPr>
@@ -522,7 +544,7 @@
           <w14:ligatures w14:val="standardContextual"/>
         </w:rPr>
       </w:pPr>
-      <w:hyperlink w:anchor="_Toc242742100" w:history="1">
+      <w:hyperlink w:anchor="_Toc242826182" w:history="1">
         <w:r>
           <w:rPr>
             <w:rStyle w:val="Hyperlink"/>
@@ -549,7 +571,7 @@
             <w:noProof/>
             <w:webHidden/>
           </w:rPr>
-          <w:instrText xml:space="preserve"> PAGEREF _Toc242742100 \h </w:instrText>
+          <w:instrText xml:space="preserve"> PAGEREF _Toc242826182 \h </w:instrText>
         </w:r>
         <w:r>
           <w:rPr>
@@ -596,7 +618,7 @@
           <w14:ligatures w14:val="standardContextual"/>
         </w:rPr>
       </w:pPr>
-      <w:hyperlink w:anchor="_Toc242742101" w:history="1">
+      <w:hyperlink w:anchor="_Toc242826183" w:history="1">
         <w:r>
           <w:rPr>
             <w:rStyle w:val="Hyperlink"/>
@@ -623,7 +645,7 @@
             <w:noProof/>
             <w:webHidden/>
           </w:rPr>
-          <w:instrText xml:space="preserve"> PAGEREF _Toc242742101 \h </w:instrText>
+          <w:instrText xml:space="preserve"> PAGEREF _Toc242826183 \h </w:instrText>
         </w:r>
         <w:r>
           <w:rPr>
@@ -670,7 +692,7 @@
           <w14:ligatures w14:val="standardContextual"/>
         </w:rPr>
       </w:pPr>
-      <w:hyperlink w:anchor="_Toc242742102" w:history="1">
+      <w:hyperlink w:anchor="_Toc242826184" w:history="1">
         <w:r>
           <w:rPr>
             <w:rStyle w:val="Hyperlink"/>
@@ -697,7 +719,7 @@
             <w:noProof/>
             <w:webHidden/>
           </w:rPr>
-          <w:instrText xml:space="preserve"> PAGEREF _Toc242742102 \h </w:instrText>
+          <w:instrText xml:space="preserve"> PAGEREF _Toc242826184 \h </w:instrText>
         </w:r>
         <w:r>
           <w:rPr>
@@ -744,7 +766,7 @@
           <w14:ligatures w14:val="standardContextual"/>
         </w:rPr>
       </w:pPr>
-      <w:hyperlink w:anchor="_Toc242742103" w:history="1">
+      <w:hyperlink w:anchor="_Toc242826185" w:history="1">
         <w:r>
           <w:rPr>
             <w:rStyle w:val="Hyperlink"/>
@@ -771,7 +793,7 @@
             <w:noProof/>
             <w:webHidden/>
           </w:rPr>
-          <w:instrText xml:space="preserve"> PAGEREF _Toc242742103 \h </w:instrText>
+          <w:instrText xml:space="preserve"> PAGEREF _Toc242826185 \h </w:instrText>
         </w:r>
         <w:r>
           <w:rPr>
@@ -818,7 +840,7 @@
           <w14:ligatures w14:val="standardContextual"/>
         </w:rPr>
       </w:pPr>
-      <w:hyperlink w:anchor="_Toc242742104" w:history="1">
+      <w:hyperlink w:anchor="_Toc242826186" w:history="1">
         <w:r>
           <w:rPr>
             <w:rStyle w:val="Hyperlink"/>
@@ -845,7 +867,7 @@
             <w:noProof/>
             <w:webHidden/>
           </w:rPr>
-          <w:instrText xml:space="preserve"> PAGEREF _Toc242742104 \h </w:instrText>
+          <w:instrText xml:space="preserve"> PAGEREF _Toc242826186 \h </w:instrText>
         </w:r>
         <w:r>
           <w:rPr>
@@ -892,7 +914,7 @@
           <w14:ligatures w14:val="standardContextual"/>
         </w:rPr>
       </w:pPr>
-      <w:hyperlink w:anchor="_Toc242742105" w:history="1">
+      <w:hyperlink w:anchor="_Toc242826187" w:history="1">
         <w:r>
           <w:rPr>
             <w:rStyle w:val="Hyperlink"/>
@@ -919,7 +941,7 @@
             <w:noProof/>
             <w:webHidden/>
           </w:rPr>
-          <w:instrText xml:space="preserve"> PAGEREF _Toc242742105 \h </w:instrText>
+          <w:instrText xml:space="preserve"> PAGEREF _Toc242826187 \h </w:instrText>
         </w:r>
         <w:r>
           <w:rPr>
@@ -966,7 +988,7 @@
           <w14:ligatures w14:val="standardContextual"/>
         </w:rPr>
       </w:pPr>
-      <w:hyperlink w:anchor="_Toc242742106" w:history="1">
+      <w:hyperlink w:anchor="_Toc242826188" w:history="1">
         <w:r>
           <w:rPr>
             <w:rStyle w:val="Hyperlink"/>
@@ -993,7 +1015,7 @@
             <w:noProof/>
             <w:webHidden/>
           </w:rPr>
-          <w:instrText xml:space="preserve"> PAGEREF _Toc242742106 \h </w:instrText>
+          <w:instrText xml:space="preserve"> PAGEREF _Toc242826188 \h </w:instrText>
         </w:r>
         <w:r>
           <w:rPr>
@@ -1040,7 +1062,7 @@
           <w14:ligatures w14:val="standardContextual"/>
         </w:rPr>
       </w:pPr>
-      <w:hyperlink w:anchor="_Toc242742107" w:history="1">
+      <w:hyperlink w:anchor="_Toc242826189" w:history="1">
         <w:r>
           <w:rPr>
             <w:rStyle w:val="Hyperlink"/>
@@ -1067,7 +1089,7 @@
             <w:noProof/>
             <w:webHidden/>
           </w:rPr>
-          <w:instrText xml:space="preserve"> PAGEREF _Toc242742107 \h </w:instrText>
+          <w:instrText xml:space="preserve"> PAGEREF _Toc242826189 \h </w:instrText>
         </w:r>
         <w:r>
           <w:rPr>
@@ -1114,7 +1136,7 @@
           <w14:ligatures w14:val="standardContextual"/>
         </w:rPr>
       </w:pPr>
-      <w:hyperlink w:anchor="_Toc242742108" w:history="1">
+      <w:hyperlink w:anchor="_Toc242826190" w:history="1">
         <w:r>
           <w:rPr>
             <w:rStyle w:val="Hyperlink"/>
@@ -1141,7 +1163,7 @@
             <w:noProof/>
             <w:webHidden/>
           </w:rPr>
-          <w:instrText xml:space="preserve"> PAGEREF _Toc242742108 \h </w:instrText>
+          <w:instrText xml:space="preserve"> PAGEREF _Toc242826190 \h </w:instrText>
         </w:r>
         <w:r>
           <w:rPr>
@@ -1188,7 +1210,7 @@
           <w14:ligatures w14:val="standardContextual"/>
         </w:rPr>
       </w:pPr>
-      <w:hyperlink w:anchor="_Toc242742109" w:history="1">
+      <w:hyperlink w:anchor="_Toc242826191" w:history="1">
         <w:r>
           <w:rPr>
             <w:rStyle w:val="Hyperlink"/>
@@ -1215,7 +1237,7 @@
             <w:noProof/>
             <w:webHidden/>
           </w:rPr>
-          <w:instrText xml:space="preserve"> PAGEREF _Toc242742109 \h </w:instrText>
+          <w:instrText xml:space="preserve"> PAGEREF _Toc242826191 \h </w:instrText>
         </w:r>
         <w:r>
           <w:rPr>
@@ -1262,7 +1284,7 @@
           <w14:ligatures w14:val="standardContextual"/>
         </w:rPr>
       </w:pPr>
-      <w:hyperlink w:anchor="_Toc242742110" w:history="1">
+      <w:hyperlink w:anchor="_Toc242826192" w:history="1">
         <w:r>
           <w:rPr>
             <w:rStyle w:val="Hyperlink"/>
@@ -1289,7 +1311,7 @@
             <w:noProof/>
             <w:webHidden/>
           </w:rPr>
-          <w:instrText xml:space="preserve"> PAGEREF _Toc242742110 \h </w:instrText>
+          <w:instrText xml:space="preserve"> PAGEREF _Toc242826192 \h </w:instrText>
         </w:r>
         <w:r>
           <w:rPr>
@@ -1336,7 +1358,7 @@
           <w14:ligatures w14:val="standardContextual"/>
         </w:rPr>
       </w:pPr>
-      <w:hyperlink w:anchor="_Toc242742111" w:history="1">
+      <w:hyperlink w:anchor="_Toc242826193" w:history="1">
         <w:r>
           <w:rPr>
             <w:rStyle w:val="Hyperlink"/>
@@ -1363,7 +1385,7 @@
             <w:noProof/>
             <w:webHidden/>
           </w:rPr>
-          <w:instrText xml:space="preserve"> PAGEREF _Toc242742111 \h </w:instrText>
+          <w:instrText xml:space="preserve"> PAGEREF _Toc242826193 \h </w:instrText>
         </w:r>
         <w:r>
           <w:rPr>
@@ -1410,7 +1432,7 @@
           <w14:ligatures w14:val="standardContextual"/>
         </w:rPr>
       </w:pPr>
-      <w:hyperlink w:anchor="_Toc242742112" w:history="1">
+      <w:hyperlink w:anchor="_Toc242826194" w:history="1">
         <w:r>
           <w:rPr>
             <w:rStyle w:val="Hyperlink"/>
@@ -1437,7 +1459,7 @@
             <w:noProof/>
             <w:webHidden/>
           </w:rPr>
-          <w:instrText xml:space="preserve"> PAGEREF _Toc242742112 \h </w:instrText>
+          <w:instrText xml:space="preserve"> PAGEREF _Toc242826194 \h </w:instrText>
         </w:r>
         <w:r>
           <w:rPr>
@@ -1484,7 +1506,7 @@
           <w14:ligatures w14:val="standardContextual"/>
         </w:rPr>
       </w:pPr>
-      <w:hyperlink w:anchor="_Toc242742113" w:history="1">
+      <w:hyperlink w:anchor="_Toc242826195" w:history="1">
         <w:r>
           <w:rPr>
             <w:rStyle w:val="Hyperlink"/>
@@ -1511,7 +1533,7 @@
             <w:noProof/>
             <w:webHidden/>
           </w:rPr>
-          <w:instrText xml:space="preserve"> PAGEREF _Toc242742113 \h </w:instrText>
+          <w:instrText xml:space="preserve"> PAGEREF _Toc242826195 \h </w:instrText>
         </w:r>
         <w:r>
           <w:rPr>
@@ -1558,7 +1580,7 @@
           <w14:ligatures w14:val="standardContextual"/>
         </w:rPr>
       </w:pPr>
-      <w:hyperlink w:anchor="_Toc242742114" w:history="1">
+      <w:hyperlink w:anchor="_Toc242826196" w:history="1">
         <w:r>
           <w:rPr>
             <w:rStyle w:val="Hyperlink"/>
@@ -1585,7 +1607,7 @@
             <w:noProof/>
             <w:webHidden/>
           </w:rPr>
-          <w:instrText xml:space="preserve"> PAGEREF _Toc242742114 \h </w:instrText>
+          <w:instrText xml:space="preserve"> PAGEREF _Toc242826196 \h </w:instrText>
         </w:r>
         <w:r>
           <w:rPr>
@@ -1632,7 +1654,7 @@
           <w14:ligatures w14:val="standardContextual"/>
         </w:rPr>
       </w:pPr>
-      <w:hyperlink w:anchor="_Toc242742115" w:history="1">
+      <w:hyperlink w:anchor="_Toc242826197" w:history="1">
         <w:r>
           <w:rPr>
             <w:rStyle w:val="Hyperlink"/>
@@ -1659,7 +1681,7 @@
             <w:noProof/>
             <w:webHidden/>
           </w:rPr>
-          <w:instrText xml:space="preserve"> PAGEREF _Toc242742115 \h </w:instrText>
+          <w:instrText xml:space="preserve"> PAGEREF _Toc242826197 \h </w:instrText>
         </w:r>
         <w:r>
           <w:rPr>
@@ -1706,7 +1728,7 @@
           <w14:ligatures w14:val="standardContextual"/>
         </w:rPr>
       </w:pPr>
-      <w:hyperlink w:anchor="_Toc242742116" w:history="1">
+      <w:hyperlink w:anchor="_Toc242826198" w:history="1">
         <w:r>
           <w:rPr>
             <w:rStyle w:val="Hyperlink"/>
@@ -1733,7 +1755,7 @@
             <w:noProof/>
             <w:webHidden/>
           </w:rPr>
-          <w:instrText xml:space="preserve"> PAGEREF _Toc242742116 \h </w:instrText>
+          <w:instrText xml:space="preserve"> PAGEREF _Toc242826198 \h </w:instrText>
         </w:r>
         <w:r>
           <w:rPr>
@@ -1780,7 +1802,7 @@
           <w14:ligatures w14:val="standardContextual"/>
         </w:rPr>
       </w:pPr>
-      <w:hyperlink w:anchor="_Toc242742117" w:history="1">
+      <w:hyperlink w:anchor="_Toc242826199" w:history="1">
         <w:r>
           <w:rPr>
             <w:rStyle w:val="Hyperlink"/>
@@ -1807,7 +1829,7 @@
             <w:noProof/>
             <w:webHidden/>
           </w:rPr>
-          <w:instrText xml:space="preserve"> PAGEREF _Toc242742117 \h </w:instrText>
+          <w:instrText xml:space="preserve"> PAGEREF _Toc242826199 \h </w:instrText>
         </w:r>
         <w:r>
           <w:rPr>
@@ -1854,7 +1876,7 @@
           <w14:ligatures w14:val="standardContextual"/>
         </w:rPr>
       </w:pPr>
-      <w:hyperlink w:anchor="_Toc242742118" w:history="1">
+      <w:hyperlink w:anchor="_Toc242826200" w:history="1">
         <w:r>
           <w:rPr>
             <w:rStyle w:val="Hyperlink"/>
@@ -1881,7 +1903,7 @@
             <w:noProof/>
             <w:webHidden/>
           </w:rPr>
-          <w:instrText xml:space="preserve"> PAGEREF _Toc242742118 \h </w:instrText>
+          <w:instrText xml:space="preserve"> PAGEREF _Toc242826200 \h </w:instrText>
         </w:r>
         <w:r>
           <w:rPr>
@@ -1959,7 +1981,7 @@
       <w:r>
         <w:fldChar w:fldCharType="separate"/>
       </w:r>
-      <w:hyperlink w:anchor="_Toc242742119" w:history="1">
+      <w:hyperlink w:anchor="_Toc242826201" w:history="1">
         <w:r>
           <w:rPr>
             <w:rStyle w:val="Hyperlink"/>
@@ -1986,7 +2008,7 @@
             <w:noProof/>
             <w:webHidden/>
           </w:rPr>
-          <w:instrText xml:space="preserve"> PAGEREF _Toc242742119 \h </w:instrText>
+          <w:instrText xml:space="preserve"> PAGEREF _Toc242826201 \h </w:instrText>
         </w:r>
         <w:r>
           <w:rPr>
@@ -2033,7 +2055,7 @@
           <w14:ligatures w14:val="standardContextual"/>
         </w:rPr>
       </w:pPr>
-      <w:hyperlink w:anchor="_Toc242742120" w:history="1">
+      <w:hyperlink w:anchor="_Toc242826202" w:history="1">
         <w:r>
           <w:rPr>
             <w:rStyle w:val="Hyperlink"/>
@@ -2060,7 +2082,7 @@
             <w:noProof/>
             <w:webHidden/>
           </w:rPr>
-          <w:instrText xml:space="preserve"> PAGEREF _Toc242742120 \h </w:instrText>
+          <w:instrText xml:space="preserve"> PAGEREF _Toc242826202 \h </w:instrText>
         </w:r>
         <w:r>
           <w:rPr>
@@ -2107,7 +2129,7 @@
           <w14:ligatures w14:val="standardContextual"/>
         </w:rPr>
       </w:pPr>
-      <w:hyperlink w:anchor="_Toc242742121" w:history="1">
+      <w:hyperlink w:anchor="_Toc242826203" w:history="1">
         <w:r>
           <w:rPr>
             <w:rStyle w:val="Hyperlink"/>
@@ -2134,7 +2156,7 @@
             <w:noProof/>
             <w:webHidden/>
           </w:rPr>
-          <w:instrText xml:space="preserve"> PAGEREF _Toc242742121 \h </w:instrText>
+          <w:instrText xml:space="preserve"> PAGEREF _Toc242826203 \h </w:instrText>
         </w:r>
         <w:r>
           <w:rPr>
@@ -2181,7 +2203,7 @@
           <w14:ligatures w14:val="standardContextual"/>
         </w:rPr>
       </w:pPr>
-      <w:hyperlink w:anchor="_Toc242742122" w:history="1">
+      <w:hyperlink w:anchor="_Toc242826204" w:history="1">
         <w:r>
           <w:rPr>
             <w:rStyle w:val="Hyperlink"/>
@@ -2208,7 +2230,7 @@
             <w:noProof/>
             <w:webHidden/>
           </w:rPr>
-          <w:instrText xml:space="preserve"> PAGEREF _Toc242742122 \h </w:instrText>
+          <w:instrText xml:space="preserve"> PAGEREF _Toc242826204 \h </w:instrText>
         </w:r>
         <w:r>
           <w:rPr>
@@ -2255,7 +2277,7 @@
           <w14:ligatures w14:val="standardContextual"/>
         </w:rPr>
       </w:pPr>
-      <w:hyperlink w:anchor="_Toc242742123" w:history="1">
+      <w:hyperlink w:anchor="_Toc242826205" w:history="1">
         <w:r>
           <w:rPr>
             <w:rStyle w:val="Hyperlink"/>
@@ -2282,7 +2304,7 @@
             <w:noProof/>
             <w:webHidden/>
           </w:rPr>
-          <w:instrText xml:space="preserve"> PAGEREF _Toc242742123 \h </w:instrText>
+          <w:instrText xml:space="preserve"> PAGEREF _Toc242826205 \h </w:instrText>
         </w:r>
         <w:r>
           <w:rPr>
@@ -2329,7 +2351,7 @@
           <w14:ligatures w14:val="standardContextual"/>
         </w:rPr>
       </w:pPr>
-      <w:hyperlink w:anchor="_Toc242742124" w:history="1">
+      <w:hyperlink w:anchor="_Toc242826206" w:history="1">
         <w:r>
           <w:rPr>
             <w:rStyle w:val="Hyperlink"/>
@@ -2356,7 +2378,7 @@
             <w:noProof/>
             <w:webHidden/>
           </w:rPr>
-          <w:instrText xml:space="preserve"> PAGEREF _Toc242742124 \h </w:instrText>
+          <w:instrText xml:space="preserve"> PAGEREF _Toc242826206 \h </w:instrText>
         </w:r>
         <w:r>
           <w:rPr>
@@ -2403,7 +2425,7 @@
           <w14:ligatures w14:val="standardContextual"/>
         </w:rPr>
       </w:pPr>
-      <w:hyperlink w:anchor="_Toc242742125" w:history="1">
+      <w:hyperlink w:anchor="_Toc242826207" w:history="1">
         <w:r>
           <w:rPr>
             <w:rStyle w:val="Hyperlink"/>
@@ -2430,7 +2452,7 @@
             <w:noProof/>
             <w:webHidden/>
           </w:rPr>
-          <w:instrText xml:space="preserve"> PAGEREF _Toc242742125 \h </w:instrText>
+          <w:instrText xml:space="preserve"> PAGEREF _Toc242826207 \h </w:instrText>
         </w:r>
         <w:r>
           <w:rPr>
@@ -2477,7 +2499,7 @@
           <w14:ligatures w14:val="standardContextual"/>
         </w:rPr>
       </w:pPr>
-      <w:hyperlink w:anchor="_Toc242742126" w:history="1">
+      <w:hyperlink w:anchor="_Toc242826208" w:history="1">
         <w:r>
           <w:rPr>
             <w:rStyle w:val="Hyperlink"/>
@@ -2504,7 +2526,7 @@
             <w:noProof/>
             <w:webHidden/>
           </w:rPr>
-          <w:instrText xml:space="preserve"> PAGEREF _Toc242742126 \h </w:instrText>
+          <w:instrText xml:space="preserve"> PAGEREF _Toc242826208 \h </w:instrText>
         </w:r>
         <w:r>
           <w:rPr>
@@ -2551,7 +2573,7 @@
           <w14:ligatures w14:val="standardContextual"/>
         </w:rPr>
       </w:pPr>
-      <w:hyperlink w:anchor="_Toc242742127" w:history="1">
+      <w:hyperlink w:anchor="_Toc242826209" w:history="1">
         <w:r>
           <w:rPr>
             <w:rStyle w:val="Hyperlink"/>
@@ -2578,7 +2600,7 @@
             <w:noProof/>
             <w:webHidden/>
           </w:rPr>
-          <w:instrText xml:space="preserve"> PAGEREF _Toc242742127 \h </w:instrText>
+          <w:instrText xml:space="preserve"> PAGEREF _Toc242826209 \h </w:instrText>
         </w:r>
         <w:r>
           <w:rPr>
@@ -2625,7 +2647,7 @@
           <w14:ligatures w14:val="standardContextual"/>
         </w:rPr>
       </w:pPr>
-      <w:hyperlink w:anchor="_Toc242742128" w:history="1">
+      <w:hyperlink w:anchor="_Toc242826210" w:history="1">
         <w:r>
           <w:rPr>
             <w:rStyle w:val="Hyperlink"/>
@@ -2652,7 +2674,7 @@
             <w:noProof/>
             <w:webHidden/>
           </w:rPr>
-          <w:instrText xml:space="preserve"> PAGEREF _Toc242742128 \h </w:instrText>
+          <w:instrText xml:space="preserve"> PAGEREF _Toc242826210 \h </w:instrText>
         </w:r>
         <w:r>
           <w:rPr>
@@ -2699,7 +2721,7 @@
           <w14:ligatures w14:val="standardContextual"/>
         </w:rPr>
       </w:pPr>
-      <w:hyperlink w:anchor="_Toc242742129" w:history="1">
+      <w:hyperlink w:anchor="_Toc242826211" w:history="1">
         <w:r>
           <w:rPr>
             <w:rStyle w:val="Hyperlink"/>
@@ -2726,7 +2748,7 @@
             <w:noProof/>
             <w:webHidden/>
           </w:rPr>
-          <w:instrText xml:space="preserve"> PAGEREF _Toc242742129 \h </w:instrText>
+          <w:instrText xml:space="preserve"> PAGEREF _Toc242826211 \h </w:instrText>
         </w:r>
         <w:r>
           <w:rPr>
@@ -2773,7 +2795,7 @@
           <w14:ligatures w14:val="standardContextual"/>
         </w:rPr>
       </w:pPr>
-      <w:hyperlink w:anchor="_Toc242742130" w:history="1">
+      <w:hyperlink w:anchor="_Toc242826212" w:history="1">
         <w:r>
           <w:rPr>
             <w:rStyle w:val="Hyperlink"/>
@@ -2800,7 +2822,7 @@
             <w:noProof/>
             <w:webHidden/>
           </w:rPr>
-          <w:instrText xml:space="preserve"> PAGEREF _Toc242742130 \h </w:instrText>
+          <w:instrText xml:space="preserve"> PAGEREF _Toc242826212 \h </w:instrText>
         </w:r>
         <w:r>
           <w:rPr>
@@ -2847,7 +2869,7 @@
           <w14:ligatures w14:val="standardContextual"/>
         </w:rPr>
       </w:pPr>
-      <w:hyperlink w:anchor="_Toc242742131" w:history="1">
+      <w:hyperlink w:anchor="_Toc242826213" w:history="1">
         <w:r>
           <w:rPr>
             <w:rStyle w:val="Hyperlink"/>
@@ -2874,7 +2896,7 @@
             <w:noProof/>
             <w:webHidden/>
           </w:rPr>
-          <w:instrText xml:space="preserve"> PAGEREF _Toc242742131 \h </w:instrText>
+          <w:instrText xml:space="preserve"> PAGEREF _Toc242826213 \h </w:instrText>
         </w:r>
         <w:r>
           <w:rPr>
@@ -2917,9 +2939,8 @@
       <w:pPr>
         <w:pStyle w:val="Heading1"/>
       </w:pPr>
-      <w:bookmarkStart w:id="0" w:name="_Toc242742097"/>
-      <w:r>
-        <w:lastRenderedPageBreak/>
+      <w:bookmarkStart w:id="0" w:name="_Toc242826179"/>
+      <w:r>
         <w:t>Resumen</w:t>
       </w:r>
       <w:bookmarkEnd w:id="0"/>
@@ -2947,9 +2968,8 @@
       <w:pPr>
         <w:pStyle w:val="Heading1"/>
       </w:pPr>
-      <w:bookmarkStart w:id="1" w:name="_Toc242742098"/>
-      <w:r>
-        <w:lastRenderedPageBreak/>
+      <w:bookmarkStart w:id="1" w:name="_Toc242826180"/>
+      <w:r>
         <w:t>Introducción</w:t>
       </w:r>
       <w:bookmarkEnd w:id="1"/>
@@ -2966,20 +2986,15 @@
     </w:p>
     <w:p>
       <w:r>
-        <w:t xml:space="preserve">El documento se organiza así: el marco teórico reúne los conceptos que sostienen las decisiones; la metodología describe cómo se organizó y verificó el trabajo; los resultados presentan el alcance, los requisitos, la arquitectura, el modelo de clases, la interfaz, la seguridad y las pruebas; la discusión interpreta los hallazgos; y las conclusiones cierran con el trabajo </w:t>
-      </w:r>
-      <w:r>
-        <w:lastRenderedPageBreak/>
-        <w:t>futuro. Los anexos contienen el registro de uso de inteligencia artificial, la matriz de trazabilidad y un glosario.</w:t>
+        <w:t>El documento se organiza así: el marco teórico reúne los conceptos que sostienen las decisiones; la metodología describe cómo se organizó y verificó el trabajo; los resultados presentan el alcance, los requisitos, la arquitectura, el modelo de clases, la interfaz, la seguridad y las pruebas; la discusión interpreta los hallazgos; y las conclusiones cierran con el trabajo futuro. Los anexos contienen el registro de uso de inteligencia artificial, la matriz de trazabilidad y un glosario.</w:t>
       </w:r>
     </w:p>
     <w:p>
       <w:pPr>
         <w:pStyle w:val="Heading1"/>
       </w:pPr>
-      <w:bookmarkStart w:id="2" w:name="_Toc242742099"/>
-      <w:r>
-        <w:lastRenderedPageBreak/>
+      <w:bookmarkStart w:id="2" w:name="_Toc242826181"/>
+      <w:r>
         <w:t>Marco teórico</w:t>
       </w:r>
       <w:bookmarkEnd w:id="2"/>
@@ -2988,7 +3003,7 @@
       <w:pPr>
         <w:pStyle w:val="Heading2"/>
       </w:pPr>
-      <w:bookmarkStart w:id="3" w:name="_Toc242742100"/>
+      <w:bookmarkStart w:id="3" w:name="_Toc242826182"/>
       <w:r>
         <w:t>Programación orientada a objetos en PHP 8</w:t>
       </w:r>
@@ -3003,7 +3018,7 @@
       <w:pPr>
         <w:pStyle w:val="Heading2"/>
       </w:pPr>
-      <w:bookmarkStart w:id="4" w:name="_Toc242742101"/>
+      <w:bookmarkStart w:id="4" w:name="_Toc242826183"/>
       <w:r>
         <w:t>Validación, saneamiento y seguridad</w:t>
       </w:r>
@@ -3018,7 +3033,7 @@
       <w:pPr>
         <w:pStyle w:val="Heading2"/>
       </w:pPr>
-      <w:bookmarkStart w:id="5" w:name="_Toc242742102"/>
+      <w:bookmarkStart w:id="5" w:name="_Toc242826184"/>
       <w:r>
         <w:t>HTTP y JSON</w:t>
       </w:r>
@@ -3026,20 +3041,15 @@
     </w:p>
     <w:p>
       <w:r>
-        <w:t xml:space="preserve">Los métodos GET deben ser seguros, es decir, no deben modificar el estado del servidor (Fielding et al., 2022). Por eso la búsqueda usa GET y las operaciones que cambian datos usan POST, seguidas de una redirección 303 (patrón Post/Redirect/Get) para evitar reenvíos </w:t>
-      </w:r>
-      <w:r>
-        <w:lastRenderedPageBreak/>
-        <w:t>accidentales. JSON es un formato de texto liviano para el intercambio de datos (Bray, 2017) y resulta adecuado como persistencia inicial antes de migrar a una base de datos.</w:t>
+        <w:t>Los métodos GET deben ser seguros, es decir, no deben modificar el estado del servidor (Fielding et al., 2022). Por eso la búsqueda usa GET y las operaciones que cambian datos usan POST, seguidas de una redirección 303 (patrón Post/Redirect/Get) para evitar reenvíos accidentales. JSON es un formato de texto liviano para el intercambio de datos (Bray, 2017) y resulta adecuado como persistencia inicial antes de migrar a una base de datos.</w:t>
       </w:r>
     </w:p>
     <w:p>
       <w:pPr>
         <w:pStyle w:val="Heading1"/>
       </w:pPr>
-      <w:bookmarkStart w:id="6" w:name="_Toc242742103"/>
-      <w:r>
-        <w:lastRenderedPageBreak/>
+      <w:bookmarkStart w:id="6" w:name="_Toc242826185"/>
+      <w:r>
         <w:t>Metodología</w:t>
       </w:r>
       <w:bookmarkEnd w:id="6"/>
@@ -3063,9 +3073,8 @@
       <w:pPr>
         <w:pStyle w:val="Heading1"/>
       </w:pPr>
-      <w:bookmarkStart w:id="7" w:name="_Toc242742104"/>
-      <w:r>
-        <w:lastRenderedPageBreak/>
+      <w:bookmarkStart w:id="7" w:name="_Toc242826186"/>
+      <w:r>
         <w:t>Resultados</w:t>
       </w:r>
       <w:bookmarkEnd w:id="7"/>
@@ -3074,7 +3083,7 @@
       <w:pPr>
         <w:pStyle w:val="Heading2"/>
       </w:pPr>
-      <w:bookmarkStart w:id="8" w:name="_Toc242742105"/>
+      <w:bookmarkStart w:id="8" w:name="_Toc242826187"/>
       <w:r>
         <w:t>Paso 1. Alcance y backlog</w:t>
       </w:r>
@@ -3104,7 +3113,7 @@
       <w:r>
         <w:instrText xml:space="preserve"> TC "</w:instrText>
       </w:r>
-      <w:bookmarkStart w:id="9" w:name="_Toc242742119"/>
+      <w:bookmarkStart w:id="9" w:name="_Toc242826201"/>
       <w:r>
         <w:instrText>Tabla 1. Alcance de la Actividad 1: dentro y fuera</w:instrText>
       </w:r>
@@ -3447,7 +3456,7 @@
       <w:r>
         <w:instrText xml:space="preserve"> TC "</w:instrText>
       </w:r>
-      <w:bookmarkStart w:id="10" w:name="_Toc242742120"/>
+      <w:bookmarkStart w:id="10" w:name="_Toc242826202"/>
       <w:r>
         <w:instrText>Tabla 2. Backlog de la Actividad 1 en el tablero de GitHub Projects</w:instrText>
       </w:r>
@@ -4253,7 +4262,7 @@
       <w:pPr>
         <w:pStyle w:val="Heading2"/>
       </w:pPr>
-      <w:bookmarkStart w:id="11" w:name="_Toc242742106"/>
+      <w:bookmarkStart w:id="11" w:name="_Toc242826188"/>
       <w:r>
         <w:t>Paso 2. Requisitos</w:t>
       </w:r>
@@ -4275,7 +4284,6 @@
         <w:rPr>
           <w:b/>
         </w:rPr>
-        <w:lastRenderedPageBreak/>
         <w:t>Tabla 3</w:t>
       </w:r>
       <w:r>
@@ -4284,7 +4292,7 @@
       <w:r>
         <w:instrText xml:space="preserve"> TC "</w:instrText>
       </w:r>
-      <w:bookmarkStart w:id="12" w:name="_Toc242742121"/>
+      <w:bookmarkStart w:id="12" w:name="_Toc242826203"/>
       <w:r>
         <w:instrText>Tabla 3. Requisitos del catálogo de la tienda</w:instrText>
       </w:r>
@@ -5043,7 +5051,7 @@
       <w:pPr>
         <w:pStyle w:val="Heading2"/>
       </w:pPr>
-      <w:bookmarkStart w:id="13" w:name="_Toc242742107"/>
+      <w:bookmarkStart w:id="13" w:name="_Toc242826189"/>
       <w:r>
         <w:t>Paso 3. Arquitectura y organización del código</w:t>
       </w:r>
@@ -5073,7 +5081,7 @@
       <w:r>
         <w:instrText xml:space="preserve"> TC "</w:instrText>
       </w:r>
-      <w:bookmarkStart w:id="14" w:name="_Toc242742122"/>
+      <w:bookmarkStart w:id="14" w:name="_Toc242826204"/>
       <w:r>
         <w:instrText>Tabla 4. Estructura de carpetas del proyecto</w:instrText>
       </w:r>
@@ -5517,9 +5525,8 @@
       <w:pPr>
         <w:pStyle w:val="Heading2"/>
       </w:pPr>
-      <w:bookmarkStart w:id="15" w:name="_Toc242742108"/>
-      <w:r>
-        <w:lastRenderedPageBreak/>
+      <w:bookmarkStart w:id="15" w:name="_Toc242826190"/>
+      <w:r>
         <w:t>Paso 4. Modelo orientado a objetos</w:t>
       </w:r>
       <w:bookmarkEnd w:id="15"/>
@@ -5548,7 +5555,7 @@
       <w:r>
         <w:instrText xml:space="preserve"> TC "</w:instrText>
       </w:r>
-      <w:bookmarkStart w:id="16" w:name="_Toc242742123"/>
+      <w:bookmarkStart w:id="16" w:name="_Toc242826205"/>
       <w:r>
         <w:instrText>Figura 1. Constructor de la clase Producto con promoción de propiedades</w:instrText>
       </w:r>
@@ -5849,18 +5856,14 @@
     </w:p>
     <w:p>
       <w:r>
-        <w:t xml:space="preserve">Catalogo concentra la lectura y escritura de los archivos JSON. Al construirse, convierte cada fila en un objeto Categoria o Producto y ofrece los métodos agregar(), reemplazar(), eliminar(), buscar() y filtrar(), este último con parámetros nombrados y valores por defecto, por ejemplo filtrar(texto: 'jean', talla: Talla::XL, orden: 'precio-asc'). El método guardar() escribe con bloqueo exclusivo (LOCK_EX) en un archivo temporal y luego lo renombra, de modo que el </w:t>
-      </w:r>
-      <w:r>
-        <w:lastRenderedPageBreak/>
-        <w:t>JSON nunca queda escrito a medias (RNF-04). Al concentrar la persistencia en una sola clase, la futura migración a MySQL solo requerirá reemplazar Catalogo.</w:t>
+        <w:t>Catalogo concentra la lectura y escritura de los archivos JSON. Al construirse, convierte cada fila en un objeto Categoria o Producto y ofrece los métodos agregar(), reemplazar(), eliminar(), buscar() y filtrar(), este último con parámetros nombrados y valores por defecto, por ejemplo filtrar(texto: 'jean', talla: Talla::XL, orden: 'precio-asc'). El método guardar() escribe con bloqueo exclusivo (LOCK_EX) en un archivo temporal y luego lo renombra, de modo que el JSON nunca queda escrito a medias (RNF-04). Al concentrar la persistencia en una sola clase, la futura migración a MySQL solo requerirá reemplazar Catalogo.</w:t>
       </w:r>
     </w:p>
     <w:p>
       <w:pPr>
         <w:pStyle w:val="Heading2"/>
       </w:pPr>
-      <w:bookmarkStart w:id="17" w:name="_Toc242742109"/>
+      <w:bookmarkStart w:id="17" w:name="_Toc242826191"/>
       <w:r>
         <w:t>Paso 5. Interfaz y formularios</w:t>
       </w:r>
@@ -5882,7 +5885,6 @@
         <w:rPr>
           <w:b/>
         </w:rPr>
-        <w:lastRenderedPageBreak/>
         <w:t>Figura 2</w:t>
       </w:r>
       <w:r>
@@ -5891,7 +5893,7 @@
       <w:r>
         <w:instrText xml:space="preserve"> TC "</w:instrText>
       </w:r>
-      <w:bookmarkStart w:id="18" w:name="_Toc242742124"/>
+      <w:bookmarkStart w:id="18" w:name="_Toc242826206"/>
       <w:r>
         <w:instrText>Figura 2. Vitrina de la tienda con los datos de demostración</w:instrText>
       </w:r>
@@ -5999,7 +6001,6 @@
         <w:rPr>
           <w:b/>
         </w:rPr>
-        <w:lastRenderedPageBreak/>
         <w:t>Figura 3</w:t>
       </w:r>
       <w:r>
@@ -6008,7 +6009,7 @@
       <w:r>
         <w:instrText xml:space="preserve"> TC "</w:instrText>
       </w:r>
-      <w:bookmarkStart w:id="19" w:name="_Toc242742125"/>
+      <w:bookmarkStart w:id="19" w:name="_Toc242826207"/>
       <w:r>
         <w:instrText>Figura 3. Formulario con errores de validación por campo</w:instrText>
       </w:r>
@@ -6104,7 +6105,7 @@
       <w:pPr>
         <w:pStyle w:val="Heading2"/>
       </w:pPr>
-      <w:bookmarkStart w:id="20" w:name="_Toc242742110"/>
+      <w:bookmarkStart w:id="20" w:name="_Toc242826192"/>
       <w:r>
         <w:t>Paso 6. Subida segura de la foto y seguridad adicional</w:t>
       </w:r>
@@ -6117,7 +6118,6 @@
     </w:p>
     <w:p>
       <w:r>
-        <w:lastRenderedPageBreak/>
         <w:t>Como adelanto del proyecto final se incorporó un token CSRF de 64 caracteres hexadecimales por sesión, comparado con hash_equals(); la eliminación solo se acepta por POST (un GET responde 405 con la cabecera Allow: POST); toda salida se escapa con la función e(); y se envían las cabeceras X-Frame-Options y Referrer-Policy. La página de gestión (Figura 4) reúne las acciones de edición y eliminación y el valor del inventario.</w:t>
       </w:r>
     </w:p>
@@ -6140,7 +6140,7 @@
       <w:r>
         <w:instrText xml:space="preserve"> TC "</w:instrText>
       </w:r>
-      <w:bookmarkStart w:id="21" w:name="_Toc242742126"/>
+      <w:bookmarkStart w:id="21" w:name="_Toc242826208"/>
       <w:r>
         <w:instrText>Figura 4. Página de gestión del catálogo</w:instrText>
       </w:r>
@@ -6236,7 +6236,7 @@
       <w:pPr>
         <w:pStyle w:val="Heading2"/>
       </w:pPr>
-      <w:bookmarkStart w:id="22" w:name="_Toc242742111"/>
+      <w:bookmarkStart w:id="22" w:name="_Toc242826193"/>
       <w:r>
         <w:t>Paso 7. Pruebas automáticas</w:t>
       </w:r>
@@ -6258,7 +6258,6 @@
         <w:rPr>
           <w:b/>
         </w:rPr>
-        <w:lastRenderedPageBreak/>
         <w:t>Tabla 5</w:t>
       </w:r>
       <w:r>
@@ -6267,7 +6266,7 @@
       <w:r>
         <w:instrText xml:space="preserve"> TC "</w:instrText>
       </w:r>
-      <w:bookmarkStart w:id="23" w:name="_Toc242742127"/>
+      <w:bookmarkStart w:id="23" w:name="_Toc242826209"/>
       <w:r>
         <w:instrText>Tabla 5. Resumen de las comprobaciones automáticas</w:instrText>
       </w:r>
@@ -6777,7 +6776,6 @@
         <w:rPr>
           <w:b/>
         </w:rPr>
-        <w:lastRenderedPageBreak/>
         <w:t>Figura 5</w:t>
       </w:r>
       <w:r>
@@ -6786,7 +6784,7 @@
       <w:r>
         <w:instrText xml:space="preserve"> TC "</w:instrText>
       </w:r>
-      <w:bookmarkStart w:id="24" w:name="_Toc242742128"/>
+      <w:bookmarkStart w:id="24" w:name="_Toc242826210"/>
       <w:r>
         <w:instrText>Figura 5. Ejecución de las pruebas automáticas</w:instrText>
       </w:r>
@@ -6894,7 +6892,6 @@
         <w:rPr>
           <w:b/>
         </w:rPr>
-        <w:lastRenderedPageBreak/>
         <w:t>Tabla 6</w:t>
       </w:r>
       <w:r>
@@ -6903,7 +6900,7 @@
       <w:r>
         <w:instrText xml:space="preserve"> TC "</w:instrText>
       </w:r>
-      <w:bookmarkStart w:id="25" w:name="_Toc242742129"/>
+      <w:bookmarkStart w:id="25" w:name="_Toc242826211"/>
       <w:r>
         <w:instrText>Tabla 6. Cálculo manual del valor del inventario</w:instrText>
       </w:r>
@@ -7873,9 +7870,8 @@
       <w:pPr>
         <w:pStyle w:val="Heading1"/>
       </w:pPr>
-      <w:bookmarkStart w:id="26" w:name="_Toc242742112"/>
-      <w:r>
-        <w:lastRenderedPageBreak/>
+      <w:bookmarkStart w:id="26" w:name="_Toc242826194"/>
+      <w:r>
         <w:t>Discusión</w:t>
       </w:r>
       <w:bookmarkEnd w:id="26"/>
@@ -7899,9 +7895,8 @@
       <w:pPr>
         <w:pStyle w:val="Heading1"/>
       </w:pPr>
-      <w:bookmarkStart w:id="27" w:name="_Toc242742113"/>
-      <w:r>
-        <w:lastRenderedPageBreak/>
+      <w:bookmarkStart w:id="27" w:name="_Toc242826195"/>
+      <w:r>
         <w:t>Conclusiones</w:t>
       </w:r>
       <w:bookmarkEnd w:id="27"/>
@@ -7920,9 +7915,8 @@
       <w:pPr>
         <w:pStyle w:val="Heading1"/>
       </w:pPr>
-      <w:bookmarkStart w:id="28" w:name="_Toc242742114"/>
-      <w:r>
-        <w:lastRenderedPageBreak/>
+      <w:bookmarkStart w:id="28" w:name="_Toc242826196"/>
+      <w:r>
         <w:t>Referencias</w:t>
       </w:r>
       <w:bookmarkEnd w:id="28"/>
@@ -8111,9 +8105,8 @@
       <w:pPr>
         <w:pStyle w:val="Heading1"/>
       </w:pPr>
-      <w:bookmarkStart w:id="29" w:name="_Toc242742115"/>
-      <w:r>
-        <w:lastRenderedPageBreak/>
+      <w:bookmarkStart w:id="29" w:name="_Toc242826197"/>
+      <w:r>
         <w:t>Anexos</w:t>
       </w:r>
       <w:bookmarkEnd w:id="29"/>
@@ -8122,7 +8115,7 @@
       <w:pPr>
         <w:pStyle w:val="Heading2"/>
       </w:pPr>
-      <w:bookmarkStart w:id="30" w:name="_Toc242742116"/>
+      <w:bookmarkStart w:id="30" w:name="_Toc242826198"/>
       <w:r>
         <w:t>Anexo A. Registro de uso de inteligencia artificial</w:t>
       </w:r>
@@ -8152,7 +8145,7 @@
       <w:r>
         <w:instrText xml:space="preserve"> TC "</w:instrText>
       </w:r>
-      <w:bookmarkStart w:id="31" w:name="_Toc242742130"/>
+      <w:bookmarkStart w:id="31" w:name="_Toc242826212"/>
       <w:r>
         <w:instrText>Tabla 7. Registro de uso de IA en la Actividad 1</w:instrText>
       </w:r>
@@ -9138,9 +9131,8 @@
       <w:pPr>
         <w:pStyle w:val="Heading2"/>
       </w:pPr>
-      <w:bookmarkStart w:id="32" w:name="_Toc242742117"/>
-      <w:r>
-        <w:lastRenderedPageBreak/>
+      <w:bookmarkStart w:id="32" w:name="_Toc242826199"/>
+      <w:r>
         <w:t>Anexo B. Matriz de trazabilidad de la Actividad 1</w:t>
       </w:r>
       <w:bookmarkEnd w:id="32"/>
@@ -9164,7 +9156,7 @@
       <w:r>
         <w:instrText xml:space="preserve"> TC "</w:instrText>
       </w:r>
-      <w:bookmarkStart w:id="33" w:name="_Toc242742131"/>
+      <w:bookmarkStart w:id="33" w:name="_Toc242826213"/>
       <w:r>
         <w:instrText>Tabla 8. Matriz de trazabilidad: requisito, issue, implementación y prueba</w:instrText>
       </w:r>
@@ -10134,7 +10126,7 @@
       <w:pPr>
         <w:pStyle w:val="Heading2"/>
       </w:pPr>
-      <w:bookmarkStart w:id="34" w:name="_Toc242742118"/>
+      <w:bookmarkStart w:id="34" w:name="_Toc242826200"/>
       <w:r>
         <w:t>Anexo C. Glosario</w:t>
       </w:r>

</xml_diff>

<commit_message>
Integrantes en portadas, presentaciones, README y bitácora
Nombres de Juan Jose Vicente y Yordy Tolavi Ruiz (agregados por ellos al README);
la tabla de integrantes del README vuelve a mostrarse como tabla.

Co-Authored-By: Claude Opus 5.5 <noreply@anthropic.com>
</commit_message>
<xml_diff>
--- a/docs/actividad-01/Informe_Actividad01_APA.docx
+++ b/docs/actividad-01/Informe_Actividad01_APA.docx
@@ -171,44 +171,40 @@
         <w:t xml:space="preserve">2. </w:t>
       </w:r>
       <w:r>
+        <w:rPr/>
+        <w:t>Juan Jose Vicente</w:t>
+      </w:r>
+    </w:p>
+    <w:p>
+      <w:pPr>
+        <w:keepNext/>
+        <w:spacing w:line="360" w:lineRule="auto"/>
+        <w:ind w:firstLine="0"/>
+        <w:jc w:val="center"/>
+      </w:pPr>
+      <w:r>
+        <w:t xml:space="preserve">3. </w:t>
+      </w:r>
+      <w:r>
+        <w:rPr/>
+        <w:t>Yordy Tolavi Ruiz</w:t>
+      </w:r>
+    </w:p>
+    <w:p>
+      <w:pPr>
+        <w:keepNext/>
+        <w:spacing w:line="360" w:lineRule="auto"/>
+        <w:ind w:firstLine="0"/>
+        <w:jc w:val="center"/>
+      </w:pPr>
+      <w:r>
+        <w:t xml:space="preserve">4. </w:t>
+      </w:r>
+      <w:r>
         <w:rPr>
           <w:highlight w:val="yellow"/>
         </w:rPr>
         <w:t>Nombre completo (GitHub: RonSalvet)</w:t>
-      </w:r>
-    </w:p>
-    <w:p>
-      <w:pPr>
-        <w:keepNext/>
-        <w:spacing w:line="360" w:lineRule="auto"/>
-        <w:ind w:firstLine="0"/>
-        <w:jc w:val="center"/>
-      </w:pPr>
-      <w:r>
-        <w:t xml:space="preserve">3. </w:t>
-      </w:r>
-      <w:r>
-        <w:rPr>
-          <w:highlight w:val="yellow"/>
-        </w:rPr>
-        <w:t>Nombre completo (GitHub: tolavi)</w:t>
-      </w:r>
-    </w:p>
-    <w:p>
-      <w:pPr>
-        <w:keepNext/>
-        <w:spacing w:line="360" w:lineRule="auto"/>
-        <w:ind w:firstLine="0"/>
-        <w:jc w:val="center"/>
-      </w:pPr>
-      <w:r>
-        <w:t xml:space="preserve">4. </w:t>
-      </w:r>
-      <w:r>
-        <w:rPr>
-          <w:highlight w:val="yellow"/>
-        </w:rPr>
-        <w:t>Nombre completo (GitHub: JUANJOVICO2021)</w:t>
       </w:r>
     </w:p>
     <w:p>

</xml_diff>

<commit_message>
Integrantes completos en informes, presentaciones, README y bitácora
Daniela Cayo Mamani, Juan Jose Vicente Cossio, Ronald Salvatierra Flores,
Yordy Tolavi Ruiz y Alejandro Cadario Lopez.

Co-Authored-By: Claude Opus 5.5 <noreply@anthropic.com>
</commit_message>
<xml_diff>
--- a/docs/actividad-01/Informe_Actividad01_APA.docx
+++ b/docs/actividad-01/Informe_Actividad01_APA.docx
@@ -168,11 +168,7 @@
         <w:jc w:val="center"/>
       </w:pPr>
       <w:r>
-        <w:t xml:space="preserve">2. </w:t>
-      </w:r>
-      <w:r>
-        <w:rPr/>
-        <w:t>Juan Jose Vicente</w:t>
+        <w:t>2. Juan Jose Vicente Cossio</w:t>
       </w:r>
     </w:p>
     <w:p>
@@ -183,11 +179,7 @@
         <w:jc w:val="center"/>
       </w:pPr>
       <w:r>
-        <w:t xml:space="preserve">3. </w:t>
-      </w:r>
-      <w:r>
-        <w:rPr/>
-        <w:t>Yordy Tolavi Ruiz</w:t>
+        <w:t>3. Ronald Salvatierra Flores</w:t>
       </w:r>
     </w:p>
     <w:p>
@@ -198,13 +190,7 @@
         <w:jc w:val="center"/>
       </w:pPr>
       <w:r>
-        <w:t xml:space="preserve">4. </w:t>
-      </w:r>
-      <w:r>
-        <w:rPr>
-          <w:highlight w:val="yellow"/>
-        </w:rPr>
-        <w:t>Nombre completo (GitHub: RonSalvet)</w:t>
+        <w:t>4. Yordy Tolavi Ruiz</w:t>
       </w:r>
     </w:p>
     <w:p>
@@ -215,13 +201,7 @@
         <w:jc w:val="center"/>
       </w:pPr>
       <w:r>
-        <w:t xml:space="preserve">5. </w:t>
-      </w:r>
-      <w:r>
-        <w:rPr>
-          <w:highlight w:val="yellow"/>
-        </w:rPr>
-        <w:t>Nombre completo (GitHub: leinn04)</w:t>
+        <w:t>5. Alejandro Cadario Lopez</w:t>
       </w:r>
     </w:p>
     <w:p>
@@ -318,7 +298,7 @@
       <w:r>
         <w:fldChar w:fldCharType="separate"/>
       </w:r>
-      <w:hyperlink w:anchor="_Toc242826179" w:history="1">
+      <w:hyperlink w:anchor="_Toc242828562" w:history="1">
         <w:r>
           <w:rPr>
             <w:rStyle w:val="Hyperlink"/>
@@ -345,7 +325,7 @@
             <w:noProof/>
             <w:webHidden/>
           </w:rPr>
-          <w:instrText xml:space="preserve"> PAGEREF _Toc242826179 \h </w:instrText>
+          <w:instrText xml:space="preserve"> PAGEREF _Toc242828562 \h </w:instrText>
         </w:r>
         <w:r>
           <w:rPr>
@@ -392,7 +372,7 @@
           <w14:ligatures w14:val="standardContextual"/>
         </w:rPr>
       </w:pPr>
-      <w:hyperlink w:anchor="_Toc242826180" w:history="1">
+      <w:hyperlink w:anchor="_Toc242828563" w:history="1">
         <w:r>
           <w:rPr>
             <w:rStyle w:val="Hyperlink"/>
@@ -419,7 +399,7 @@
             <w:noProof/>
             <w:webHidden/>
           </w:rPr>
-          <w:instrText xml:space="preserve"> PAGEREF _Toc242826180 \h </w:instrText>
+          <w:instrText xml:space="preserve"> PAGEREF _Toc242828563 \h </w:instrText>
         </w:r>
         <w:r>
           <w:rPr>
@@ -466,7 +446,7 @@
           <w14:ligatures w14:val="standardContextual"/>
         </w:rPr>
       </w:pPr>
-      <w:hyperlink w:anchor="_Toc242826181" w:history="1">
+      <w:hyperlink w:anchor="_Toc242828564" w:history="1">
         <w:r>
           <w:rPr>
             <w:rStyle w:val="Hyperlink"/>
@@ -493,7 +473,7 @@
             <w:noProof/>
             <w:webHidden/>
           </w:rPr>
-          <w:instrText xml:space="preserve"> PAGEREF _Toc242826181 \h </w:instrText>
+          <w:instrText xml:space="preserve"> PAGEREF _Toc242828564 \h </w:instrText>
         </w:r>
         <w:r>
           <w:rPr>
@@ -540,7 +520,7 @@
           <w14:ligatures w14:val="standardContextual"/>
         </w:rPr>
       </w:pPr>
-      <w:hyperlink w:anchor="_Toc242826182" w:history="1">
+      <w:hyperlink w:anchor="_Toc242828565" w:history="1">
         <w:r>
           <w:rPr>
             <w:rStyle w:val="Hyperlink"/>
@@ -567,7 +547,7 @@
             <w:noProof/>
             <w:webHidden/>
           </w:rPr>
-          <w:instrText xml:space="preserve"> PAGEREF _Toc242826182 \h </w:instrText>
+          <w:instrText xml:space="preserve"> PAGEREF _Toc242828565 \h </w:instrText>
         </w:r>
         <w:r>
           <w:rPr>
@@ -614,7 +594,7 @@
           <w14:ligatures w14:val="standardContextual"/>
         </w:rPr>
       </w:pPr>
-      <w:hyperlink w:anchor="_Toc242826183" w:history="1">
+      <w:hyperlink w:anchor="_Toc242828566" w:history="1">
         <w:r>
           <w:rPr>
             <w:rStyle w:val="Hyperlink"/>
@@ -641,7 +621,7 @@
             <w:noProof/>
             <w:webHidden/>
           </w:rPr>
-          <w:instrText xml:space="preserve"> PAGEREF _Toc242826183 \h </w:instrText>
+          <w:instrText xml:space="preserve"> PAGEREF _Toc242828566 \h </w:instrText>
         </w:r>
         <w:r>
           <w:rPr>
@@ -688,7 +668,7 @@
           <w14:ligatures w14:val="standardContextual"/>
         </w:rPr>
       </w:pPr>
-      <w:hyperlink w:anchor="_Toc242826184" w:history="1">
+      <w:hyperlink w:anchor="_Toc242828567" w:history="1">
         <w:r>
           <w:rPr>
             <w:rStyle w:val="Hyperlink"/>
@@ -715,7 +695,7 @@
             <w:noProof/>
             <w:webHidden/>
           </w:rPr>
-          <w:instrText xml:space="preserve"> PAGEREF _Toc242826184 \h </w:instrText>
+          <w:instrText xml:space="preserve"> PAGEREF _Toc242828567 \h </w:instrText>
         </w:r>
         <w:r>
           <w:rPr>
@@ -762,7 +742,7 @@
           <w14:ligatures w14:val="standardContextual"/>
         </w:rPr>
       </w:pPr>
-      <w:hyperlink w:anchor="_Toc242826185" w:history="1">
+      <w:hyperlink w:anchor="_Toc242828568" w:history="1">
         <w:r>
           <w:rPr>
             <w:rStyle w:val="Hyperlink"/>
@@ -789,7 +769,7 @@
             <w:noProof/>
             <w:webHidden/>
           </w:rPr>
-          <w:instrText xml:space="preserve"> PAGEREF _Toc242826185 \h </w:instrText>
+          <w:instrText xml:space="preserve"> PAGEREF _Toc242828568 \h </w:instrText>
         </w:r>
         <w:r>
           <w:rPr>
@@ -836,7 +816,7 @@
           <w14:ligatures w14:val="standardContextual"/>
         </w:rPr>
       </w:pPr>
-      <w:hyperlink w:anchor="_Toc242826186" w:history="1">
+      <w:hyperlink w:anchor="_Toc242828569" w:history="1">
         <w:r>
           <w:rPr>
             <w:rStyle w:val="Hyperlink"/>
@@ -863,7 +843,7 @@
             <w:noProof/>
             <w:webHidden/>
           </w:rPr>
-          <w:instrText xml:space="preserve"> PAGEREF _Toc242826186 \h </w:instrText>
+          <w:instrText xml:space="preserve"> PAGEREF _Toc242828569 \h </w:instrText>
         </w:r>
         <w:r>
           <w:rPr>
@@ -910,7 +890,7 @@
           <w14:ligatures w14:val="standardContextual"/>
         </w:rPr>
       </w:pPr>
-      <w:hyperlink w:anchor="_Toc242826187" w:history="1">
+      <w:hyperlink w:anchor="_Toc242828570" w:history="1">
         <w:r>
           <w:rPr>
             <w:rStyle w:val="Hyperlink"/>
@@ -937,7 +917,7 @@
             <w:noProof/>
             <w:webHidden/>
           </w:rPr>
-          <w:instrText xml:space="preserve"> PAGEREF _Toc242826187 \h </w:instrText>
+          <w:instrText xml:space="preserve"> PAGEREF _Toc242828570 \h </w:instrText>
         </w:r>
         <w:r>
           <w:rPr>
@@ -984,7 +964,7 @@
           <w14:ligatures w14:val="standardContextual"/>
         </w:rPr>
       </w:pPr>
-      <w:hyperlink w:anchor="_Toc242826188" w:history="1">
+      <w:hyperlink w:anchor="_Toc242828571" w:history="1">
         <w:r>
           <w:rPr>
             <w:rStyle w:val="Hyperlink"/>
@@ -1011,7 +991,7 @@
             <w:noProof/>
             <w:webHidden/>
           </w:rPr>
-          <w:instrText xml:space="preserve"> PAGEREF _Toc242826188 \h </w:instrText>
+          <w:instrText xml:space="preserve"> PAGEREF _Toc242828571 \h </w:instrText>
         </w:r>
         <w:r>
           <w:rPr>
@@ -1058,7 +1038,7 @@
           <w14:ligatures w14:val="standardContextual"/>
         </w:rPr>
       </w:pPr>
-      <w:hyperlink w:anchor="_Toc242826189" w:history="1">
+      <w:hyperlink w:anchor="_Toc242828572" w:history="1">
         <w:r>
           <w:rPr>
             <w:rStyle w:val="Hyperlink"/>
@@ -1085,7 +1065,7 @@
             <w:noProof/>
             <w:webHidden/>
           </w:rPr>
-          <w:instrText xml:space="preserve"> PAGEREF _Toc242826189 \h </w:instrText>
+          <w:instrText xml:space="preserve"> PAGEREF _Toc242828572 \h </w:instrText>
         </w:r>
         <w:r>
           <w:rPr>
@@ -1132,7 +1112,7 @@
           <w14:ligatures w14:val="standardContextual"/>
         </w:rPr>
       </w:pPr>
-      <w:hyperlink w:anchor="_Toc242826190" w:history="1">
+      <w:hyperlink w:anchor="_Toc242828573" w:history="1">
         <w:r>
           <w:rPr>
             <w:rStyle w:val="Hyperlink"/>
@@ -1159,7 +1139,7 @@
             <w:noProof/>
             <w:webHidden/>
           </w:rPr>
-          <w:instrText xml:space="preserve"> PAGEREF _Toc242826190 \h </w:instrText>
+          <w:instrText xml:space="preserve"> PAGEREF _Toc242828573 \h </w:instrText>
         </w:r>
         <w:r>
           <w:rPr>
@@ -1206,7 +1186,7 @@
           <w14:ligatures w14:val="standardContextual"/>
         </w:rPr>
       </w:pPr>
-      <w:hyperlink w:anchor="_Toc242826191" w:history="1">
+      <w:hyperlink w:anchor="_Toc242828574" w:history="1">
         <w:r>
           <w:rPr>
             <w:rStyle w:val="Hyperlink"/>
@@ -1233,7 +1213,7 @@
             <w:noProof/>
             <w:webHidden/>
           </w:rPr>
-          <w:instrText xml:space="preserve"> PAGEREF _Toc242826191 \h </w:instrText>
+          <w:instrText xml:space="preserve"> PAGEREF _Toc242828574 \h </w:instrText>
         </w:r>
         <w:r>
           <w:rPr>
@@ -1280,7 +1260,7 @@
           <w14:ligatures w14:val="standardContextual"/>
         </w:rPr>
       </w:pPr>
-      <w:hyperlink w:anchor="_Toc242826192" w:history="1">
+      <w:hyperlink w:anchor="_Toc242828575" w:history="1">
         <w:r>
           <w:rPr>
             <w:rStyle w:val="Hyperlink"/>
@@ -1307,7 +1287,7 @@
             <w:noProof/>
             <w:webHidden/>
           </w:rPr>
-          <w:instrText xml:space="preserve"> PAGEREF _Toc242826192 \h </w:instrText>
+          <w:instrText xml:space="preserve"> PAGEREF _Toc242828575 \h </w:instrText>
         </w:r>
         <w:r>
           <w:rPr>
@@ -1354,7 +1334,7 @@
           <w14:ligatures w14:val="standardContextual"/>
         </w:rPr>
       </w:pPr>
-      <w:hyperlink w:anchor="_Toc242826193" w:history="1">
+      <w:hyperlink w:anchor="_Toc242828576" w:history="1">
         <w:r>
           <w:rPr>
             <w:rStyle w:val="Hyperlink"/>
@@ -1381,7 +1361,7 @@
             <w:noProof/>
             <w:webHidden/>
           </w:rPr>
-          <w:instrText xml:space="preserve"> PAGEREF _Toc242826193 \h </w:instrText>
+          <w:instrText xml:space="preserve"> PAGEREF _Toc242828576 \h </w:instrText>
         </w:r>
         <w:r>
           <w:rPr>
@@ -1428,7 +1408,7 @@
           <w14:ligatures w14:val="standardContextual"/>
         </w:rPr>
       </w:pPr>
-      <w:hyperlink w:anchor="_Toc242826194" w:history="1">
+      <w:hyperlink w:anchor="_Toc242828577" w:history="1">
         <w:r>
           <w:rPr>
             <w:rStyle w:val="Hyperlink"/>
@@ -1455,7 +1435,7 @@
             <w:noProof/>
             <w:webHidden/>
           </w:rPr>
-          <w:instrText xml:space="preserve"> PAGEREF _Toc242826194 \h </w:instrText>
+          <w:instrText xml:space="preserve"> PAGEREF _Toc242828577 \h </w:instrText>
         </w:r>
         <w:r>
           <w:rPr>
@@ -1502,7 +1482,7 @@
           <w14:ligatures w14:val="standardContextual"/>
         </w:rPr>
       </w:pPr>
-      <w:hyperlink w:anchor="_Toc242826195" w:history="1">
+      <w:hyperlink w:anchor="_Toc242828578" w:history="1">
         <w:r>
           <w:rPr>
             <w:rStyle w:val="Hyperlink"/>
@@ -1529,7 +1509,7 @@
             <w:noProof/>
             <w:webHidden/>
           </w:rPr>
-          <w:instrText xml:space="preserve"> PAGEREF _Toc242826195 \h </w:instrText>
+          <w:instrText xml:space="preserve"> PAGEREF _Toc242828578 \h </w:instrText>
         </w:r>
         <w:r>
           <w:rPr>
@@ -1576,7 +1556,7 @@
           <w14:ligatures w14:val="standardContextual"/>
         </w:rPr>
       </w:pPr>
-      <w:hyperlink w:anchor="_Toc242826196" w:history="1">
+      <w:hyperlink w:anchor="_Toc242828579" w:history="1">
         <w:r>
           <w:rPr>
             <w:rStyle w:val="Hyperlink"/>
@@ -1603,7 +1583,7 @@
             <w:noProof/>
             <w:webHidden/>
           </w:rPr>
-          <w:instrText xml:space="preserve"> PAGEREF _Toc242826196 \h </w:instrText>
+          <w:instrText xml:space="preserve"> PAGEREF _Toc242828579 \h </w:instrText>
         </w:r>
         <w:r>
           <w:rPr>
@@ -1650,7 +1630,7 @@
           <w14:ligatures w14:val="standardContextual"/>
         </w:rPr>
       </w:pPr>
-      <w:hyperlink w:anchor="_Toc242826197" w:history="1">
+      <w:hyperlink w:anchor="_Toc242828580" w:history="1">
         <w:r>
           <w:rPr>
             <w:rStyle w:val="Hyperlink"/>
@@ -1677,7 +1657,7 @@
             <w:noProof/>
             <w:webHidden/>
           </w:rPr>
-          <w:instrText xml:space="preserve"> PAGEREF _Toc242826197 \h </w:instrText>
+          <w:instrText xml:space="preserve"> PAGEREF _Toc242828580 \h </w:instrText>
         </w:r>
         <w:r>
           <w:rPr>
@@ -1724,7 +1704,7 @@
           <w14:ligatures w14:val="standardContextual"/>
         </w:rPr>
       </w:pPr>
-      <w:hyperlink w:anchor="_Toc242826198" w:history="1">
+      <w:hyperlink w:anchor="_Toc242828581" w:history="1">
         <w:r>
           <w:rPr>
             <w:rStyle w:val="Hyperlink"/>
@@ -1751,7 +1731,7 @@
             <w:noProof/>
             <w:webHidden/>
           </w:rPr>
-          <w:instrText xml:space="preserve"> PAGEREF _Toc242826198 \h </w:instrText>
+          <w:instrText xml:space="preserve"> PAGEREF _Toc242828581 \h </w:instrText>
         </w:r>
         <w:r>
           <w:rPr>
@@ -1798,7 +1778,7 @@
           <w14:ligatures w14:val="standardContextual"/>
         </w:rPr>
       </w:pPr>
-      <w:hyperlink w:anchor="_Toc242826199" w:history="1">
+      <w:hyperlink w:anchor="_Toc242828582" w:history="1">
         <w:r>
           <w:rPr>
             <w:rStyle w:val="Hyperlink"/>
@@ -1825,7 +1805,7 @@
             <w:noProof/>
             <w:webHidden/>
           </w:rPr>
-          <w:instrText xml:space="preserve"> PAGEREF _Toc242826199 \h </w:instrText>
+          <w:instrText xml:space="preserve"> PAGEREF _Toc242828582 \h </w:instrText>
         </w:r>
         <w:r>
           <w:rPr>
@@ -1872,7 +1852,7 @@
           <w14:ligatures w14:val="standardContextual"/>
         </w:rPr>
       </w:pPr>
-      <w:hyperlink w:anchor="_Toc242826200" w:history="1">
+      <w:hyperlink w:anchor="_Toc242828583" w:history="1">
         <w:r>
           <w:rPr>
             <w:rStyle w:val="Hyperlink"/>
@@ -1899,7 +1879,7 @@
             <w:noProof/>
             <w:webHidden/>
           </w:rPr>
-          <w:instrText xml:space="preserve"> PAGEREF _Toc242826200 \h </w:instrText>
+          <w:instrText xml:space="preserve"> PAGEREF _Toc242828583 \h </w:instrText>
         </w:r>
         <w:r>
           <w:rPr>
@@ -1977,7 +1957,7 @@
       <w:r>
         <w:fldChar w:fldCharType="separate"/>
       </w:r>
-      <w:hyperlink w:anchor="_Toc242826201" w:history="1">
+      <w:hyperlink w:anchor="_Toc242828584" w:history="1">
         <w:r>
           <w:rPr>
             <w:rStyle w:val="Hyperlink"/>
@@ -2004,7 +1984,7 @@
             <w:noProof/>
             <w:webHidden/>
           </w:rPr>
-          <w:instrText xml:space="preserve"> PAGEREF _Toc242826201 \h </w:instrText>
+          <w:instrText xml:space="preserve"> PAGEREF _Toc242828584 \h </w:instrText>
         </w:r>
         <w:r>
           <w:rPr>
@@ -2051,7 +2031,7 @@
           <w14:ligatures w14:val="standardContextual"/>
         </w:rPr>
       </w:pPr>
-      <w:hyperlink w:anchor="_Toc242826202" w:history="1">
+      <w:hyperlink w:anchor="_Toc242828585" w:history="1">
         <w:r>
           <w:rPr>
             <w:rStyle w:val="Hyperlink"/>
@@ -2078,7 +2058,7 @@
             <w:noProof/>
             <w:webHidden/>
           </w:rPr>
-          <w:instrText xml:space="preserve"> PAGEREF _Toc242826202 \h </w:instrText>
+          <w:instrText xml:space="preserve"> PAGEREF _Toc242828585 \h </w:instrText>
         </w:r>
         <w:r>
           <w:rPr>
@@ -2125,7 +2105,7 @@
           <w14:ligatures w14:val="standardContextual"/>
         </w:rPr>
       </w:pPr>
-      <w:hyperlink w:anchor="_Toc242826203" w:history="1">
+      <w:hyperlink w:anchor="_Toc242828586" w:history="1">
         <w:r>
           <w:rPr>
             <w:rStyle w:val="Hyperlink"/>
@@ -2152,7 +2132,7 @@
             <w:noProof/>
             <w:webHidden/>
           </w:rPr>
-          <w:instrText xml:space="preserve"> PAGEREF _Toc242826203 \h </w:instrText>
+          <w:instrText xml:space="preserve"> PAGEREF _Toc242828586 \h </w:instrText>
         </w:r>
         <w:r>
           <w:rPr>
@@ -2199,7 +2179,7 @@
           <w14:ligatures w14:val="standardContextual"/>
         </w:rPr>
       </w:pPr>
-      <w:hyperlink w:anchor="_Toc242826204" w:history="1">
+      <w:hyperlink w:anchor="_Toc242828587" w:history="1">
         <w:r>
           <w:rPr>
             <w:rStyle w:val="Hyperlink"/>
@@ -2226,7 +2206,7 @@
             <w:noProof/>
             <w:webHidden/>
           </w:rPr>
-          <w:instrText xml:space="preserve"> PAGEREF _Toc242826204 \h </w:instrText>
+          <w:instrText xml:space="preserve"> PAGEREF _Toc242828587 \h </w:instrText>
         </w:r>
         <w:r>
           <w:rPr>
@@ -2273,7 +2253,7 @@
           <w14:ligatures w14:val="standardContextual"/>
         </w:rPr>
       </w:pPr>
-      <w:hyperlink w:anchor="_Toc242826205" w:history="1">
+      <w:hyperlink w:anchor="_Toc242828588" w:history="1">
         <w:r>
           <w:rPr>
             <w:rStyle w:val="Hyperlink"/>
@@ -2300,7 +2280,7 @@
             <w:noProof/>
             <w:webHidden/>
           </w:rPr>
-          <w:instrText xml:space="preserve"> PAGEREF _Toc242826205 \h </w:instrText>
+          <w:instrText xml:space="preserve"> PAGEREF _Toc242828588 \h </w:instrText>
         </w:r>
         <w:r>
           <w:rPr>
@@ -2347,7 +2327,7 @@
           <w14:ligatures w14:val="standardContextual"/>
         </w:rPr>
       </w:pPr>
-      <w:hyperlink w:anchor="_Toc242826206" w:history="1">
+      <w:hyperlink w:anchor="_Toc242828589" w:history="1">
         <w:r>
           <w:rPr>
             <w:rStyle w:val="Hyperlink"/>
@@ -2374,7 +2354,7 @@
             <w:noProof/>
             <w:webHidden/>
           </w:rPr>
-          <w:instrText xml:space="preserve"> PAGEREF _Toc242826206 \h </w:instrText>
+          <w:instrText xml:space="preserve"> PAGEREF _Toc242828589 \h </w:instrText>
         </w:r>
         <w:r>
           <w:rPr>
@@ -2421,7 +2401,7 @@
           <w14:ligatures w14:val="standardContextual"/>
         </w:rPr>
       </w:pPr>
-      <w:hyperlink w:anchor="_Toc242826207" w:history="1">
+      <w:hyperlink w:anchor="_Toc242828590" w:history="1">
         <w:r>
           <w:rPr>
             <w:rStyle w:val="Hyperlink"/>
@@ -2448,7 +2428,7 @@
             <w:noProof/>
             <w:webHidden/>
           </w:rPr>
-          <w:instrText xml:space="preserve"> PAGEREF _Toc242826207 \h </w:instrText>
+          <w:instrText xml:space="preserve"> PAGEREF _Toc242828590 \h </w:instrText>
         </w:r>
         <w:r>
           <w:rPr>
@@ -2495,7 +2475,7 @@
           <w14:ligatures w14:val="standardContextual"/>
         </w:rPr>
       </w:pPr>
-      <w:hyperlink w:anchor="_Toc242826208" w:history="1">
+      <w:hyperlink w:anchor="_Toc242828591" w:history="1">
         <w:r>
           <w:rPr>
             <w:rStyle w:val="Hyperlink"/>
@@ -2522,7 +2502,7 @@
             <w:noProof/>
             <w:webHidden/>
           </w:rPr>
-          <w:instrText xml:space="preserve"> PAGEREF _Toc242826208 \h </w:instrText>
+          <w:instrText xml:space="preserve"> PAGEREF _Toc242828591 \h </w:instrText>
         </w:r>
         <w:r>
           <w:rPr>
@@ -2569,7 +2549,7 @@
           <w14:ligatures w14:val="standardContextual"/>
         </w:rPr>
       </w:pPr>
-      <w:hyperlink w:anchor="_Toc242826209" w:history="1">
+      <w:hyperlink w:anchor="_Toc242828592" w:history="1">
         <w:r>
           <w:rPr>
             <w:rStyle w:val="Hyperlink"/>
@@ -2596,7 +2576,7 @@
             <w:noProof/>
             <w:webHidden/>
           </w:rPr>
-          <w:instrText xml:space="preserve"> PAGEREF _Toc242826209 \h </w:instrText>
+          <w:instrText xml:space="preserve"> PAGEREF _Toc242828592 \h </w:instrText>
         </w:r>
         <w:r>
           <w:rPr>
@@ -2643,7 +2623,7 @@
           <w14:ligatures w14:val="standardContextual"/>
         </w:rPr>
       </w:pPr>
-      <w:hyperlink w:anchor="_Toc242826210" w:history="1">
+      <w:hyperlink w:anchor="_Toc242828593" w:history="1">
         <w:r>
           <w:rPr>
             <w:rStyle w:val="Hyperlink"/>
@@ -2670,7 +2650,7 @@
             <w:noProof/>
             <w:webHidden/>
           </w:rPr>
-          <w:instrText xml:space="preserve"> PAGEREF _Toc242826210 \h </w:instrText>
+          <w:instrText xml:space="preserve"> PAGEREF _Toc242828593 \h </w:instrText>
         </w:r>
         <w:r>
           <w:rPr>
@@ -2717,7 +2697,7 @@
           <w14:ligatures w14:val="standardContextual"/>
         </w:rPr>
       </w:pPr>
-      <w:hyperlink w:anchor="_Toc242826211" w:history="1">
+      <w:hyperlink w:anchor="_Toc242828594" w:history="1">
         <w:r>
           <w:rPr>
             <w:rStyle w:val="Hyperlink"/>
@@ -2744,7 +2724,7 @@
             <w:noProof/>
             <w:webHidden/>
           </w:rPr>
-          <w:instrText xml:space="preserve"> PAGEREF _Toc242826211 \h </w:instrText>
+          <w:instrText xml:space="preserve"> PAGEREF _Toc242828594 \h </w:instrText>
         </w:r>
         <w:r>
           <w:rPr>
@@ -2791,7 +2771,7 @@
           <w14:ligatures w14:val="standardContextual"/>
         </w:rPr>
       </w:pPr>
-      <w:hyperlink w:anchor="_Toc242826212" w:history="1">
+      <w:hyperlink w:anchor="_Toc242828595" w:history="1">
         <w:r>
           <w:rPr>
             <w:rStyle w:val="Hyperlink"/>
@@ -2818,7 +2798,7 @@
             <w:noProof/>
             <w:webHidden/>
           </w:rPr>
-          <w:instrText xml:space="preserve"> PAGEREF _Toc242826212 \h </w:instrText>
+          <w:instrText xml:space="preserve"> PAGEREF _Toc242828595 \h </w:instrText>
         </w:r>
         <w:r>
           <w:rPr>
@@ -2865,7 +2845,7 @@
           <w14:ligatures w14:val="standardContextual"/>
         </w:rPr>
       </w:pPr>
-      <w:hyperlink w:anchor="_Toc242826213" w:history="1">
+      <w:hyperlink w:anchor="_Toc242828596" w:history="1">
         <w:r>
           <w:rPr>
             <w:rStyle w:val="Hyperlink"/>
@@ -2892,7 +2872,7 @@
             <w:noProof/>
             <w:webHidden/>
           </w:rPr>
-          <w:instrText xml:space="preserve"> PAGEREF _Toc242826213 \h </w:instrText>
+          <w:instrText xml:space="preserve"> PAGEREF _Toc242828596 \h </w:instrText>
         </w:r>
         <w:r>
           <w:rPr>
@@ -2935,8 +2915,9 @@
       <w:pPr>
         <w:pStyle w:val="Heading1"/>
       </w:pPr>
-      <w:bookmarkStart w:id="0" w:name="_Toc242826179"/>
-      <w:r>
+      <w:bookmarkStart w:id="0" w:name="_Toc242828562"/>
+      <w:r>
+        <w:lastRenderedPageBreak/>
         <w:t>Resumen</w:t>
       </w:r>
       <w:bookmarkEnd w:id="0"/>
@@ -2964,8 +2945,9 @@
       <w:pPr>
         <w:pStyle w:val="Heading1"/>
       </w:pPr>
-      <w:bookmarkStart w:id="1" w:name="_Toc242826180"/>
-      <w:r>
+      <w:bookmarkStart w:id="1" w:name="_Toc242828563"/>
+      <w:r>
+        <w:lastRenderedPageBreak/>
         <w:t>Introducción</w:t>
       </w:r>
       <w:bookmarkEnd w:id="1"/>
@@ -2982,15 +2964,20 @@
     </w:p>
     <w:p>
       <w:r>
-        <w:t>El documento se organiza así: el marco teórico reúne los conceptos que sostienen las decisiones; la metodología describe cómo se organizó y verificó el trabajo; los resultados presentan el alcance, los requisitos, la arquitectura, el modelo de clases, la interfaz, la seguridad y las pruebas; la discusión interpreta los hallazgos; y las conclusiones cierran con el trabajo futuro. Los anexos contienen el registro de uso de inteligencia artificial, la matriz de trazabilidad y un glosario.</w:t>
+        <w:t xml:space="preserve">El documento se organiza así: el marco teórico reúne los conceptos que sostienen las decisiones; la metodología describe cómo se organizó y verificó el trabajo; los resultados presentan el alcance, los requisitos, la arquitectura, el modelo de clases, la interfaz, la seguridad y las pruebas; la discusión interpreta los hallazgos; y las conclusiones cierran con el trabajo </w:t>
+      </w:r>
+      <w:r>
+        <w:lastRenderedPageBreak/>
+        <w:t>futuro. Los anexos contienen el registro de uso de inteligencia artificial, la matriz de trazabilidad y un glosario.</w:t>
       </w:r>
     </w:p>
     <w:p>
       <w:pPr>
         <w:pStyle w:val="Heading1"/>
       </w:pPr>
-      <w:bookmarkStart w:id="2" w:name="_Toc242826181"/>
-      <w:r>
+      <w:bookmarkStart w:id="2" w:name="_Toc242828564"/>
+      <w:r>
+        <w:lastRenderedPageBreak/>
         <w:t>Marco teórico</w:t>
       </w:r>
       <w:bookmarkEnd w:id="2"/>
@@ -2999,7 +2986,7 @@
       <w:pPr>
         <w:pStyle w:val="Heading2"/>
       </w:pPr>
-      <w:bookmarkStart w:id="3" w:name="_Toc242826182"/>
+      <w:bookmarkStart w:id="3" w:name="_Toc242828565"/>
       <w:r>
         <w:t>Programación orientada a objetos en PHP 8</w:t>
       </w:r>
@@ -3014,7 +3001,7 @@
       <w:pPr>
         <w:pStyle w:val="Heading2"/>
       </w:pPr>
-      <w:bookmarkStart w:id="4" w:name="_Toc242826183"/>
+      <w:bookmarkStart w:id="4" w:name="_Toc242828566"/>
       <w:r>
         <w:t>Validación, saneamiento y seguridad</w:t>
       </w:r>
@@ -3029,7 +3016,7 @@
       <w:pPr>
         <w:pStyle w:val="Heading2"/>
       </w:pPr>
-      <w:bookmarkStart w:id="5" w:name="_Toc242826184"/>
+      <w:bookmarkStart w:id="5" w:name="_Toc242828567"/>
       <w:r>
         <w:t>HTTP y JSON</w:t>
       </w:r>
@@ -3037,15 +3024,20 @@
     </w:p>
     <w:p>
       <w:r>
-        <w:t>Los métodos GET deben ser seguros, es decir, no deben modificar el estado del servidor (Fielding et al., 2022). Por eso la búsqueda usa GET y las operaciones que cambian datos usan POST, seguidas de una redirección 303 (patrón Post/Redirect/Get) para evitar reenvíos accidentales. JSON es un formato de texto liviano para el intercambio de datos (Bray, 2017) y resulta adecuado como persistencia inicial antes de migrar a una base de datos.</w:t>
+        <w:t xml:space="preserve">Los métodos GET deben ser seguros, es decir, no deben modificar el estado del servidor (Fielding et al., 2022). Por eso la búsqueda usa GET y las operaciones que cambian datos usan POST, seguidas de una redirección 303 (patrón Post/Redirect/Get) para evitar reenvíos </w:t>
+      </w:r>
+      <w:r>
+        <w:lastRenderedPageBreak/>
+        <w:t>accidentales. JSON es un formato de texto liviano para el intercambio de datos (Bray, 2017) y resulta adecuado como persistencia inicial antes de migrar a una base de datos.</w:t>
       </w:r>
     </w:p>
     <w:p>
       <w:pPr>
         <w:pStyle w:val="Heading1"/>
       </w:pPr>
-      <w:bookmarkStart w:id="6" w:name="_Toc242826185"/>
-      <w:r>
+      <w:bookmarkStart w:id="6" w:name="_Toc242828568"/>
+      <w:r>
+        <w:lastRenderedPageBreak/>
         <w:t>Metodología</w:t>
       </w:r>
       <w:bookmarkEnd w:id="6"/>
@@ -3069,8 +3061,9 @@
       <w:pPr>
         <w:pStyle w:val="Heading1"/>
       </w:pPr>
-      <w:bookmarkStart w:id="7" w:name="_Toc242826186"/>
-      <w:r>
+      <w:bookmarkStart w:id="7" w:name="_Toc242828569"/>
+      <w:r>
+        <w:lastRenderedPageBreak/>
         <w:t>Resultados</w:t>
       </w:r>
       <w:bookmarkEnd w:id="7"/>
@@ -3079,7 +3072,7 @@
       <w:pPr>
         <w:pStyle w:val="Heading2"/>
       </w:pPr>
-      <w:bookmarkStart w:id="8" w:name="_Toc242826187"/>
+      <w:bookmarkStart w:id="8" w:name="_Toc242828570"/>
       <w:r>
         <w:t>Paso 1. Alcance y backlog</w:t>
       </w:r>
@@ -3109,7 +3102,7 @@
       <w:r>
         <w:instrText xml:space="preserve"> TC "</w:instrText>
       </w:r>
-      <w:bookmarkStart w:id="9" w:name="_Toc242826201"/>
+      <w:bookmarkStart w:id="9" w:name="_Toc242828584"/>
       <w:r>
         <w:instrText>Tabla 1. Alcance de la Actividad 1: dentro y fuera</w:instrText>
       </w:r>
@@ -3452,7 +3445,7 @@
       <w:r>
         <w:instrText xml:space="preserve"> TC "</w:instrText>
       </w:r>
-      <w:bookmarkStart w:id="10" w:name="_Toc242826202"/>
+      <w:bookmarkStart w:id="10" w:name="_Toc242828585"/>
       <w:r>
         <w:instrText>Tabla 2. Backlog de la Actividad 1 en el tablero de GitHub Projects</w:instrText>
       </w:r>
@@ -4258,7 +4251,7 @@
       <w:pPr>
         <w:pStyle w:val="Heading2"/>
       </w:pPr>
-      <w:bookmarkStart w:id="11" w:name="_Toc242826188"/>
+      <w:bookmarkStart w:id="11" w:name="_Toc242828571"/>
       <w:r>
         <w:t>Paso 2. Requisitos</w:t>
       </w:r>
@@ -4280,6 +4273,7 @@
         <w:rPr>
           <w:b/>
         </w:rPr>
+        <w:lastRenderedPageBreak/>
         <w:t>Tabla 3</w:t>
       </w:r>
       <w:r>
@@ -4288,7 +4282,7 @@
       <w:r>
         <w:instrText xml:space="preserve"> TC "</w:instrText>
       </w:r>
-      <w:bookmarkStart w:id="12" w:name="_Toc242826203"/>
+      <w:bookmarkStart w:id="12" w:name="_Toc242828586"/>
       <w:r>
         <w:instrText>Tabla 3. Requisitos del catálogo de la tienda</w:instrText>
       </w:r>
@@ -5047,7 +5041,7 @@
       <w:pPr>
         <w:pStyle w:val="Heading2"/>
       </w:pPr>
-      <w:bookmarkStart w:id="13" w:name="_Toc242826189"/>
+      <w:bookmarkStart w:id="13" w:name="_Toc242828572"/>
       <w:r>
         <w:t>Paso 3. Arquitectura y organización del código</w:t>
       </w:r>
@@ -5077,7 +5071,7 @@
       <w:r>
         <w:instrText xml:space="preserve"> TC "</w:instrText>
       </w:r>
-      <w:bookmarkStart w:id="14" w:name="_Toc242826204"/>
+      <w:bookmarkStart w:id="14" w:name="_Toc242828587"/>
       <w:r>
         <w:instrText>Tabla 4. Estructura de carpetas del proyecto</w:instrText>
       </w:r>
@@ -5521,8 +5515,9 @@
       <w:pPr>
         <w:pStyle w:val="Heading2"/>
       </w:pPr>
-      <w:bookmarkStart w:id="15" w:name="_Toc242826190"/>
-      <w:r>
+      <w:bookmarkStart w:id="15" w:name="_Toc242828573"/>
+      <w:r>
+        <w:lastRenderedPageBreak/>
         <w:t>Paso 4. Modelo orientado a objetos</w:t>
       </w:r>
       <w:bookmarkEnd w:id="15"/>
@@ -5551,7 +5546,7 @@
       <w:r>
         <w:instrText xml:space="preserve"> TC "</w:instrText>
       </w:r>
-      <w:bookmarkStart w:id="16" w:name="_Toc242826205"/>
+      <w:bookmarkStart w:id="16" w:name="_Toc242828588"/>
       <w:r>
         <w:instrText>Figura 1. Constructor de la clase Producto con promoción de propiedades</w:instrText>
       </w:r>
@@ -5852,14 +5847,18 @@
     </w:p>
     <w:p>
       <w:r>
-        <w:t>Catalogo concentra la lectura y escritura de los archivos JSON. Al construirse, convierte cada fila en un objeto Categoria o Producto y ofrece los métodos agregar(), reemplazar(), eliminar(), buscar() y filtrar(), este último con parámetros nombrados y valores por defecto, por ejemplo filtrar(texto: 'jean', talla: Talla::XL, orden: 'precio-asc'). El método guardar() escribe con bloqueo exclusivo (LOCK_EX) en un archivo temporal y luego lo renombra, de modo que el JSON nunca queda escrito a medias (RNF-04). Al concentrar la persistencia en una sola clase, la futura migración a MySQL solo requerirá reemplazar Catalogo.</w:t>
+        <w:t xml:space="preserve">Catalogo concentra la lectura y escritura de los archivos JSON. Al construirse, convierte cada fila en un objeto Categoria o Producto y ofrece los métodos agregar(), reemplazar(), eliminar(), buscar() y filtrar(), este último con parámetros nombrados y valores por defecto, por ejemplo filtrar(texto: 'jean', talla: Talla::XL, orden: 'precio-asc'). El método guardar() escribe con bloqueo exclusivo (LOCK_EX) en un archivo temporal y luego lo renombra, de modo que el </w:t>
+      </w:r>
+      <w:r>
+        <w:lastRenderedPageBreak/>
+        <w:t>JSON nunca queda escrito a medias (RNF-04). Al concentrar la persistencia en una sola clase, la futura migración a MySQL solo requerirá reemplazar Catalogo.</w:t>
       </w:r>
     </w:p>
     <w:p>
       <w:pPr>
         <w:pStyle w:val="Heading2"/>
       </w:pPr>
-      <w:bookmarkStart w:id="17" w:name="_Toc242826191"/>
+      <w:bookmarkStart w:id="17" w:name="_Toc242828574"/>
       <w:r>
         <w:t>Paso 5. Interfaz y formularios</w:t>
       </w:r>
@@ -5881,6 +5880,7 @@
         <w:rPr>
           <w:b/>
         </w:rPr>
+        <w:lastRenderedPageBreak/>
         <w:t>Figura 2</w:t>
       </w:r>
       <w:r>
@@ -5889,7 +5889,7 @@
       <w:r>
         <w:instrText xml:space="preserve"> TC "</w:instrText>
       </w:r>
-      <w:bookmarkStart w:id="18" w:name="_Toc242826206"/>
+      <w:bookmarkStart w:id="18" w:name="_Toc242828589"/>
       <w:r>
         <w:instrText>Figura 2. Vitrina de la tienda con los datos de demostración</w:instrText>
       </w:r>
@@ -5997,6 +5997,7 @@
         <w:rPr>
           <w:b/>
         </w:rPr>
+        <w:lastRenderedPageBreak/>
         <w:t>Figura 3</w:t>
       </w:r>
       <w:r>
@@ -6005,7 +6006,7 @@
       <w:r>
         <w:instrText xml:space="preserve"> TC "</w:instrText>
       </w:r>
-      <w:bookmarkStart w:id="19" w:name="_Toc242826207"/>
+      <w:bookmarkStart w:id="19" w:name="_Toc242828590"/>
       <w:r>
         <w:instrText>Figura 3. Formulario con errores de validación por campo</w:instrText>
       </w:r>
@@ -6101,7 +6102,7 @@
       <w:pPr>
         <w:pStyle w:val="Heading2"/>
       </w:pPr>
-      <w:bookmarkStart w:id="20" w:name="_Toc242826192"/>
+      <w:bookmarkStart w:id="20" w:name="_Toc242828575"/>
       <w:r>
         <w:t>Paso 6. Subida segura de la foto y seguridad adicional</w:t>
       </w:r>
@@ -6114,6 +6115,7 @@
     </w:p>
     <w:p>
       <w:r>
+        <w:lastRenderedPageBreak/>
         <w:t>Como adelanto del proyecto final se incorporó un token CSRF de 64 caracteres hexadecimales por sesión, comparado con hash_equals(); la eliminación solo se acepta por POST (un GET responde 405 con la cabecera Allow: POST); toda salida se escapa con la función e(); y se envían las cabeceras X-Frame-Options y Referrer-Policy. La página de gestión (Figura 4) reúne las acciones de edición y eliminación y el valor del inventario.</w:t>
       </w:r>
     </w:p>
@@ -6136,7 +6138,7 @@
       <w:r>
         <w:instrText xml:space="preserve"> TC "</w:instrText>
       </w:r>
-      <w:bookmarkStart w:id="21" w:name="_Toc242826208"/>
+      <w:bookmarkStart w:id="21" w:name="_Toc242828591"/>
       <w:r>
         <w:instrText>Figura 4. Página de gestión del catálogo</w:instrText>
       </w:r>
@@ -6232,7 +6234,7 @@
       <w:pPr>
         <w:pStyle w:val="Heading2"/>
       </w:pPr>
-      <w:bookmarkStart w:id="22" w:name="_Toc242826193"/>
+      <w:bookmarkStart w:id="22" w:name="_Toc242828576"/>
       <w:r>
         <w:t>Paso 7. Pruebas automáticas</w:t>
       </w:r>
@@ -6254,6 +6256,7 @@
         <w:rPr>
           <w:b/>
         </w:rPr>
+        <w:lastRenderedPageBreak/>
         <w:t>Tabla 5</w:t>
       </w:r>
       <w:r>
@@ -6262,7 +6265,7 @@
       <w:r>
         <w:instrText xml:space="preserve"> TC "</w:instrText>
       </w:r>
-      <w:bookmarkStart w:id="23" w:name="_Toc242826209"/>
+      <w:bookmarkStart w:id="23" w:name="_Toc242828592"/>
       <w:r>
         <w:instrText>Tabla 5. Resumen de las comprobaciones automáticas</w:instrText>
       </w:r>
@@ -6772,6 +6775,7 @@
         <w:rPr>
           <w:b/>
         </w:rPr>
+        <w:lastRenderedPageBreak/>
         <w:t>Figura 5</w:t>
       </w:r>
       <w:r>
@@ -6780,7 +6784,7 @@
       <w:r>
         <w:instrText xml:space="preserve"> TC "</w:instrText>
       </w:r>
-      <w:bookmarkStart w:id="24" w:name="_Toc242826210"/>
+      <w:bookmarkStart w:id="24" w:name="_Toc242828593"/>
       <w:r>
         <w:instrText>Figura 5. Ejecución de las pruebas automáticas</w:instrText>
       </w:r>
@@ -6888,6 +6892,7 @@
         <w:rPr>
           <w:b/>
         </w:rPr>
+        <w:lastRenderedPageBreak/>
         <w:t>Tabla 6</w:t>
       </w:r>
       <w:r>
@@ -6896,7 +6901,7 @@
       <w:r>
         <w:instrText xml:space="preserve"> TC "</w:instrText>
       </w:r>
-      <w:bookmarkStart w:id="25" w:name="_Toc242826211"/>
+      <w:bookmarkStart w:id="25" w:name="_Toc242828594"/>
       <w:r>
         <w:instrText>Tabla 6. Cálculo manual del valor del inventario</w:instrText>
       </w:r>
@@ -7866,8 +7871,9 @@
       <w:pPr>
         <w:pStyle w:val="Heading1"/>
       </w:pPr>
-      <w:bookmarkStart w:id="26" w:name="_Toc242826194"/>
-      <w:r>
+      <w:bookmarkStart w:id="26" w:name="_Toc242828577"/>
+      <w:r>
+        <w:lastRenderedPageBreak/>
         <w:t>Discusión</w:t>
       </w:r>
       <w:bookmarkEnd w:id="26"/>
@@ -7891,8 +7897,9 @@
       <w:pPr>
         <w:pStyle w:val="Heading1"/>
       </w:pPr>
-      <w:bookmarkStart w:id="27" w:name="_Toc242826195"/>
-      <w:r>
+      <w:bookmarkStart w:id="27" w:name="_Toc242828578"/>
+      <w:r>
+        <w:lastRenderedPageBreak/>
         <w:t>Conclusiones</w:t>
       </w:r>
       <w:bookmarkEnd w:id="27"/>
@@ -7911,8 +7918,9 @@
       <w:pPr>
         <w:pStyle w:val="Heading1"/>
       </w:pPr>
-      <w:bookmarkStart w:id="28" w:name="_Toc242826196"/>
-      <w:r>
+      <w:bookmarkStart w:id="28" w:name="_Toc242828579"/>
+      <w:r>
+        <w:lastRenderedPageBreak/>
         <w:t>Referencias</w:t>
       </w:r>
       <w:bookmarkEnd w:id="28"/>
@@ -8101,8 +8109,9 @@
       <w:pPr>
         <w:pStyle w:val="Heading1"/>
       </w:pPr>
-      <w:bookmarkStart w:id="29" w:name="_Toc242826197"/>
-      <w:r>
+      <w:bookmarkStart w:id="29" w:name="_Toc242828580"/>
+      <w:r>
+        <w:lastRenderedPageBreak/>
         <w:t>Anexos</w:t>
       </w:r>
       <w:bookmarkEnd w:id="29"/>
@@ -8111,7 +8120,7 @@
       <w:pPr>
         <w:pStyle w:val="Heading2"/>
       </w:pPr>
-      <w:bookmarkStart w:id="30" w:name="_Toc242826198"/>
+      <w:bookmarkStart w:id="30" w:name="_Toc242828581"/>
       <w:r>
         <w:t>Anexo A. Registro de uso de inteligencia artificial</w:t>
       </w:r>
@@ -8141,7 +8150,7 @@
       <w:r>
         <w:instrText xml:space="preserve"> TC "</w:instrText>
       </w:r>
-      <w:bookmarkStart w:id="31" w:name="_Toc242826212"/>
+      <w:bookmarkStart w:id="31" w:name="_Toc242828595"/>
       <w:r>
         <w:instrText>Tabla 7. Registro de uso de IA en la Actividad 1</w:instrText>
       </w:r>
@@ -9127,8 +9136,9 @@
       <w:pPr>
         <w:pStyle w:val="Heading2"/>
       </w:pPr>
-      <w:bookmarkStart w:id="32" w:name="_Toc242826199"/>
-      <w:r>
+      <w:bookmarkStart w:id="32" w:name="_Toc242828582"/>
+      <w:r>
+        <w:lastRenderedPageBreak/>
         <w:t>Anexo B. Matriz de trazabilidad de la Actividad 1</w:t>
       </w:r>
       <w:bookmarkEnd w:id="32"/>
@@ -9152,7 +9162,7 @@
       <w:r>
         <w:instrText xml:space="preserve"> TC "</w:instrText>
       </w:r>
-      <w:bookmarkStart w:id="33" w:name="_Toc242826213"/>
+      <w:bookmarkStart w:id="33" w:name="_Toc242828596"/>
       <w:r>
         <w:instrText>Tabla 8. Matriz de trazabilidad: requisito, issue, implementación y prueba</w:instrText>
       </w:r>
@@ -10122,7 +10132,7 @@
       <w:pPr>
         <w:pStyle w:val="Heading2"/>
       </w:pPr>
-      <w:bookmarkStart w:id="34" w:name="_Toc242826200"/>
+      <w:bookmarkStart w:id="34" w:name="_Toc242828583"/>
       <w:r>
         <w:t>Anexo C. Glosario</w:t>
       </w:r>

</xml_diff>